<commit_message>
Mirror live case studies in the .docx resume template
Replaces the Lorem Ipsum placeholder with the meta case-study card,
reorders to match the website (Basecamp first, building-this-site
second), and points both titles at canonical malxavi.com URLs.

Co-Authored-By: Claude Opus 4.7 (1M context) <noreply@anthropic.com>
</commit_message>
<xml_diff>
--- a/public/resume/malcolm-xavier-resume-template.docx
+++ b/public/resume/malcolm-xavier-resume-template.docx
@@ -40,7 +40,7 @@
       <w:pPr>
         <w:spacing w:after="40" w:before="0"/>
       </w:pPr>
-      <w:hyperlink w:history="1" r:id="rIdusdfmnrak6unhquwfavib">
+      <w:hyperlink w:history="1" r:id="rIdkge4qvfvcsj5xopoqu8kv">
         <w:r>
           <w:rPr>
             <w:rFonts w:ascii="DM Sans" w:cs="DM Sans" w:eastAsia="DM Sans" w:hAnsi="DM Sans"/>
@@ -69,7 +69,7 @@
         </w:rPr>
         <w:t xml:space="preserve"> · </w:t>
       </w:r>
-      <w:hyperlink w:history="1" r:id="rId8dsfdl3gbgafxjt2kc9ql">
+      <w:hyperlink w:history="1" r:id="rIdumqznkfdhjqs8k5213mxx">
         <w:r>
           <w:rPr>
             <w:rFonts w:ascii="DM Sans" w:cs="DM Sans" w:eastAsia="DM Sans" w:hAnsi="DM Sans"/>
@@ -116,7 +116,7 @@
       <w:pPr>
         <w:spacing w:after="200" w:before="0"/>
       </w:pPr>
-      <w:hyperlink w:history="1" r:id="rIdxq5jlaoex_cpjkf2uhcn1">
+      <w:hyperlink w:history="1" r:id="rIdu7ehyjj3ymtx_yiiu2fpv">
         <w:r>
           <w:rPr>
             <w:rFonts w:ascii="DM Sans" w:cs="DM Sans" w:eastAsia="DM Sans" w:hAnsi="DM Sans"/>
@@ -145,7 +145,7 @@
         </w:rPr>
         <w:t xml:space="preserve"> · </w:t>
       </w:r>
-      <w:hyperlink w:history="1" r:id="rIdlobn_h3o1rt1wyww__bfw">
+      <w:hyperlink w:history="1" r:id="rIdmdrou6k_ftr8unuwt1srr">
         <w:r>
           <w:rPr>
             <w:rFonts w:ascii="DM Sans" w:cs="DM Sans" w:eastAsia="DM Sans" w:hAnsi="DM Sans"/>
@@ -174,7 +174,7 @@
         </w:rPr>
         <w:t xml:space="preserve"> · </w:t>
       </w:r>
-      <w:hyperlink w:history="1" r:id="rIdmkdmqgievbptgxn_fwvzh">
+      <w:hyperlink w:history="1" r:id="rIddhq0ghb4vood01ru21u0u">
         <w:r>
           <w:rPr>
             <w:rFonts w:ascii="DM Sans" w:cs="DM Sans" w:eastAsia="DM Sans" w:hAnsi="DM Sans"/>
@@ -235,7 +235,7 @@
         <w:keepNext/>
         <w:spacing w:after="0" w:before="0"/>
       </w:pPr>
-      <w:hyperlink w:history="1" r:id="rIdkgd9prl9kxw2izb2x0j16">
+      <w:hyperlink w:history="1" r:id="rIdjphrkfxae6icpeqj70sss">
         <w:r>
           <w:rPr>
             <w:rFonts w:ascii="DM Sans" w:cs="DM Sans" w:eastAsia="DM Sans" w:hAnsi="DM Sans"/>
@@ -614,7 +614,7 @@
         <w:keepNext/>
         <w:spacing w:after="0" w:before="200"/>
       </w:pPr>
-      <w:hyperlink w:history="1" r:id="rId6msxfpqprfcxeijxtf2jq">
+      <w:hyperlink w:history="1" r:id="rIdzj17lltus5tgzezr-661f">
         <w:r>
           <w:rPr>
             <w:rFonts w:ascii="DM Sans" w:cs="DM Sans" w:eastAsia="DM Sans" w:hAnsi="DM Sans"/>
@@ -887,7 +887,7 @@
         </w:rPr>
         <w:t xml:space="preserve">Product consulting for </w:t>
       </w:r>
-      <w:hyperlink w:history="1" r:id="rIdj6nkv_ppmbzrokosfirqr">
+      <w:hyperlink w:history="1" r:id="rId-vrw3iql5b2a6dlqxjd8n">
         <w:r>
           <w:rPr>
             <w:rFonts w:ascii="DM Sans" w:cs="DM Sans" w:eastAsia="DM Sans" w:hAnsi="DM Sans"/>
@@ -916,7 +916,7 @@
         </w:rPr>
         <w:t xml:space="preserve"> (SaaS, music industry); developed content strategy for </w:t>
       </w:r>
-      <w:hyperlink w:history="1" r:id="rIdfbirmpt-ql7dwnbbhvouq">
+      <w:hyperlink w:history="1" r:id="rIdx8pv5fu0weydajl8-iapr">
         <w:r>
           <w:rPr>
             <w:rFonts w:ascii="DM Sans" w:cs="DM Sans" w:eastAsia="DM Sans" w:hAnsi="DM Sans"/>
@@ -951,7 +951,7 @@
         <w:keepNext/>
         <w:spacing w:after="0" w:before="200"/>
       </w:pPr>
-      <w:hyperlink w:history="1" r:id="rIdgosntmplwo2i9eb9txr8x">
+      <w:hyperlink w:history="1" r:id="rIdur40rw9svykemo4ggz48l">
         <w:r>
           <w:rPr>
             <w:rFonts w:ascii="DM Sans" w:cs="DM Sans" w:eastAsia="DM Sans" w:hAnsi="DM Sans"/>
@@ -1136,7 +1136,7 @@
         <w:keepNext/>
         <w:spacing w:after="0" w:before="200"/>
       </w:pPr>
-      <w:hyperlink w:history="1" r:id="rId2j--adywz6jvs9sfllpqy">
+      <w:hyperlink w:history="1" r:id="rIdsn-8-hepxflclmqlxqspb">
         <w:r>
           <w:rPr>
             <w:rFonts w:ascii="DM Sans" w:cs="DM Sans" w:eastAsia="DM Sans" w:hAnsi="DM Sans"/>
@@ -1271,7 +1271,7 @@
         <w:keepNext/>
         <w:spacing w:after="0" w:before="200"/>
       </w:pPr>
-      <w:hyperlink w:history="1" r:id="rIdn-w-eauxreu5gmndf2ted">
+      <w:hyperlink w:history="1" r:id="rIdxbmawwcy8hzuah_eti8ou">
         <w:r>
           <w:rPr>
             <w:rFonts w:ascii="DM Sans" w:cs="DM Sans" w:eastAsia="DM Sans" w:hAnsi="DM Sans"/>
@@ -1832,47 +1832,7 @@
         <w:keepNext/>
         <w:spacing w:after="60" w:before="0"/>
       </w:pPr>
-      <w:hyperlink w:history="1" r:id="rIdzu99ikwzcexyr_uyvx2xa">
-        <w:r>
-          <w:rPr>
-            <w:rFonts w:ascii="DM Sans" w:cs="DM Sans" w:eastAsia="DM Sans" w:hAnsi="DM Sans"/>
-            <w:b/>
-            <w:bCs/>
-            <w:i w:val="false"/>
-            <w:iCs w:val="false"/>
-            <w:color w:val="000000"/>
-            <w:sz w:val="24"/>
-            <w:szCs w:val="24"/>
-            <w:u w:val="single" w:color="000000"/>
-          </w:rPr>
-          <w:t xml:space="preserve">malxavi.com — A portfolio in public</w:t>
-        </w:r>
-      </w:hyperlink>
-    </w:p>
-    <w:p>
-      <w:pPr>
-        <w:spacing w:after="40" w:before="0"/>
-      </w:pPr>
-      <w:r>
-        <w:rPr>
-          <w:rFonts w:ascii="DM Sans" w:cs="DM Sans" w:eastAsia="DM Sans" w:hAnsi="DM Sans"/>
-          <w:b w:val="false"/>
-          <w:bCs w:val="false"/>
-          <w:i w:val="false"/>
-          <w:iCs w:val="false"/>
-          <w:color w:val="000000"/>
-          <w:sz w:val="21"/>
-          <w:szCs w:val="21"/>
-        </w:rPr>
-        <w:t xml:space="preserve">Lorem ipsum dolor sit amet, consectetur adipiscing elit. Sed do eiusmod tempor incididunt ut labore et dolore magna aliqua, ut enim ad minim veniam. Built end-to-end with Claude Code, Next.js, and Vercel.</w:t>
-      </w:r>
-    </w:p>
-    <w:p>
-      <w:pPr>
-        <w:keepNext/>
-        <w:spacing w:after="60" w:before="200"/>
-      </w:pPr>
-      <w:hyperlink w:history="1" r:id="rIdsryzs7zpys8ujtnj0zop9">
+      <w:hyperlink w:history="1" r:id="rId-dpme7djeq2dzl0il5jio">
         <w:r>
           <w:rPr>
             <w:rFonts w:ascii="DM Sans" w:cs="DM Sans" w:eastAsia="DM Sans" w:hAnsi="DM Sans"/>
@@ -1905,6 +1865,46 @@
           <w:szCs w:val="21"/>
         </w:rPr>
         <w:t xml:space="preserve">An interactive coffee-personality quiz exploring product discovery, conversational UX, and lightweight personalization for a fictional specialty roaster. Built end-to-end with Claude Code, Next.js, and Vercel.</w:t>
+      </w:r>
+    </w:p>
+    <w:p>
+      <w:pPr>
+        <w:keepNext/>
+        <w:spacing w:after="60" w:before="200"/>
+      </w:pPr>
+      <w:hyperlink w:history="1" r:id="rIdqhci3mldgtoheuxhfvvlm">
+        <w:r>
+          <w:rPr>
+            <w:rFonts w:ascii="DM Sans" w:cs="DM Sans" w:eastAsia="DM Sans" w:hAnsi="DM Sans"/>
+            <w:b/>
+            <w:bCs/>
+            <w:i w:val="false"/>
+            <w:iCs w:val="false"/>
+            <w:color w:val="000000"/>
+            <w:sz w:val="24"/>
+            <w:szCs w:val="24"/>
+            <w:u w:val="single" w:color="000000"/>
+          </w:rPr>
+          <w:t xml:space="preserve">Building this site, one rate-limit at a time</w:t>
+        </w:r>
+      </w:hyperlink>
+    </w:p>
+    <w:p>
+      <w:pPr>
+        <w:spacing w:after="40" w:before="0"/>
+      </w:pPr>
+      <w:r>
+        <w:rPr>
+          <w:rFonts w:ascii="DM Sans" w:cs="DM Sans" w:eastAsia="DM Sans" w:hAnsi="DM Sans"/>
+          <w:b w:val="false"/>
+          <w:bCs w:val="false"/>
+          <w:i w:val="false"/>
+          <w:iCs w:val="false"/>
+          <w:color w:val="000000"/>
+          <w:sz w:val="21"/>
+          <w:szCs w:val="21"/>
+        </w:rPr>
+        <w:t xml:space="preserve">A meta case study on shipping this portfolio in seven days with Claude Code as build partner. Architecture bets, two production incidents, and what AI-native PM work looks like when the human stays in the loop.</w:t>
       </w:r>
     </w:p>
     <w:sectPr>
@@ -2042,7 +2042,7 @@
       </w:pBdr>
       <w:spacing w:after="80" w:before="40"/>
     </w:pPr>
-    <w:hyperlink w:history="1" r:id="rId71r48coon4i2k0dutzr2o">
+    <w:hyperlink w:history="1" r:id="rId1ez8j1kd76bj6lcwupbqp">
       <w:r>
         <w:rPr>
           <w:rFonts w:ascii="DM Sans" w:cs="DM Sans" w:eastAsia="DM Sans" w:hAnsi="DM Sans"/>
@@ -2067,7 +2067,7 @@
       </w:rPr>
       <w:t xml:space="preserve"> · </w:t>
     </w:r>
-    <w:hyperlink w:history="1" r:id="rIddavbk_-smixd-f_0culin">
+    <w:hyperlink w:history="1" r:id="rIdyhtvfg62k7mlsleq7g_3r">
       <w:r>
         <w:rPr>
           <w:rFonts w:ascii="DM Sans" w:cs="DM Sans" w:eastAsia="DM Sans" w:hAnsi="DM Sans"/>
@@ -2118,7 +2118,7 @@
       </w:rPr>
       <w:t xml:space="preserve"> · </w:t>
     </w:r>
-    <w:hyperlink w:history="1" r:id="rIdrllmu_o_3vj9sd9t9nomo">
+    <w:hyperlink w:history="1" r:id="rId-m04ljf5acum1l9drfgnp">
       <w:r>
         <w:rPr>
           <w:rFonts w:ascii="DM Sans" w:cs="DM Sans" w:eastAsia="DM Sans" w:hAnsi="DM Sans"/>
@@ -2143,7 +2143,7 @@
       </w:rPr>
       <w:t xml:space="preserve"> · </w:t>
     </w:r>
-    <w:hyperlink w:history="1" r:id="rIdsmlwaa5xd1yvp9zlg32ia">
+    <w:hyperlink w:history="1" r:id="rIdq3q0dteysxzfvh0lf0ist">
       <w:r>
         <w:rPr>
           <w:rFonts w:ascii="DM Sans" w:cs="DM Sans" w:eastAsia="DM Sans" w:hAnsi="DM Sans"/>
@@ -2168,7 +2168,7 @@
       </w:rPr>
       <w:t xml:space="preserve"> · </w:t>
     </w:r>
-    <w:hyperlink w:history="1" r:id="rIdqemviw6_gqq2bjezdjhe8">
+    <w:hyperlink w:history="1" r:id="rId5eq7ck99urodwkrv31aeb">
       <w:r>
         <w:rPr>
           <w:rFonts w:ascii="DM Sans" w:cs="DM Sans" w:eastAsia="DM Sans" w:hAnsi="DM Sans"/>

</xml_diff>

<commit_message>
Switch site email to malcolm@malxavi.com
Custom-domain inbox is live and verified, replacing the gmail fallback
that shipped during build. Updated CONTACT.email in resume-data.tsx
and the hardcoded mailto: in Footer.tsx; regenerated the .docx
template to match (build-resume-docx.mjs already pointed at the new
address). Source sweep for malcolm.x.evans returns clean.

Co-Authored-By: Claude Opus 4.7 (1M context) <noreply@anthropic.com>
</commit_message>
<xml_diff>
--- a/public/resume/malcolm-xavier-resume-template.docx
+++ b/public/resume/malcolm-xavier-resume-template.docx
@@ -40,7 +40,7 @@
       <w:pPr>
         <w:spacing w:after="40" w:before="0"/>
       </w:pPr>
-      <w:hyperlink w:history="1" r:id="rIdqsi6mhv08mfcjfdjwwn9s">
+      <w:hyperlink w:history="1" r:id="rIdqw58r4kdf_rpu5yplney2">
         <w:r>
           <w:rPr>
             <w:rFonts w:ascii="DM Sans" w:cs="DM Sans" w:eastAsia="DM Sans" w:hAnsi="DM Sans"/>
@@ -69,7 +69,7 @@
         </w:rPr>
         <w:t xml:space="preserve"> · </w:t>
       </w:r>
-      <w:hyperlink w:history="1" r:id="rIddqqhdgpm-o8jmyn0whboo">
+      <w:hyperlink w:history="1" r:id="rId-3zuh2m9fi-jrvhg4axlp">
         <w:r>
           <w:rPr>
             <w:rFonts w:ascii="DM Sans" w:cs="DM Sans" w:eastAsia="DM Sans" w:hAnsi="DM Sans"/>
@@ -116,7 +116,7 @@
       <w:pPr>
         <w:spacing w:after="200" w:before="0"/>
       </w:pPr>
-      <w:hyperlink w:history="1" r:id="rIdf5oomcxprxtr9ndzpdtap">
+      <w:hyperlink w:history="1" r:id="rIdb_odfcyjwoezgmpcdslqe">
         <w:r>
           <w:rPr>
             <w:rFonts w:ascii="DM Sans" w:cs="DM Sans" w:eastAsia="DM Sans" w:hAnsi="DM Sans"/>
@@ -145,7 +145,7 @@
         </w:rPr>
         <w:t xml:space="preserve"> · </w:t>
       </w:r>
-      <w:hyperlink w:history="1" r:id="rIdrrhjdhkiysfcgo1y-_bb4">
+      <w:hyperlink w:history="1" r:id="rIdiokvdf6yr4frbqls9umki">
         <w:r>
           <w:rPr>
             <w:rFonts w:ascii="DM Sans" w:cs="DM Sans" w:eastAsia="DM Sans" w:hAnsi="DM Sans"/>
@@ -174,7 +174,7 @@
         </w:rPr>
         <w:t xml:space="preserve"> · </w:t>
       </w:r>
-      <w:hyperlink w:history="1" r:id="rIdqft1llmbdyx7cap4qvmti">
+      <w:hyperlink w:history="1" r:id="rIdhyf0vuuce8ejgsyiamq52">
         <w:r>
           <w:rPr>
             <w:rFonts w:ascii="DM Sans" w:cs="DM Sans" w:eastAsia="DM Sans" w:hAnsi="DM Sans"/>
@@ -235,7 +235,7 @@
         <w:keepNext/>
         <w:spacing w:after="0" w:before="0"/>
       </w:pPr>
-      <w:hyperlink w:history="1" r:id="rIdzx9bbj8kdkrk4dgl8jpx0">
+      <w:hyperlink w:history="1" r:id="rIdwttqzvxtpk5wqau6bqnco">
         <w:r>
           <w:rPr>
             <w:rFonts w:ascii="DM Sans" w:cs="DM Sans" w:eastAsia="DM Sans" w:hAnsi="DM Sans"/>
@@ -653,7 +653,7 @@
         <w:keepNext/>
         <w:spacing w:after="0" w:before="200"/>
       </w:pPr>
-      <w:hyperlink w:history="1" r:id="rIde3upfd9vnrzitu9c7etxw">
+      <w:hyperlink w:history="1" r:id="rIdnmrji73a9vn-cb3snay-o">
         <w:r>
           <w:rPr>
             <w:rFonts w:ascii="DM Sans" w:cs="DM Sans" w:eastAsia="DM Sans" w:hAnsi="DM Sans"/>
@@ -965,7 +965,7 @@
         </w:rPr>
         <w:t xml:space="preserve">Product consulting for </w:t>
       </w:r>
-      <w:hyperlink w:history="1" r:id="rIdsshlebxmhdv0evuisanzw">
+      <w:hyperlink w:history="1" r:id="rIdztr-d2whph5x1xvciv2o8">
         <w:r>
           <w:rPr>
             <w:rFonts w:ascii="DM Sans" w:cs="DM Sans" w:eastAsia="DM Sans" w:hAnsi="DM Sans"/>
@@ -994,7 +994,7 @@
         </w:rPr>
         <w:t xml:space="preserve"> (SaaS, music industry); developed content strategy for </w:t>
       </w:r>
-      <w:hyperlink w:history="1" r:id="rIdojbebwyxl3ey3rkybwkyh">
+      <w:hyperlink w:history="1" r:id="rIdsiftwpz4dvaiizd7cuqlz">
         <w:r>
           <w:rPr>
             <w:rFonts w:ascii="DM Sans" w:cs="DM Sans" w:eastAsia="DM Sans" w:hAnsi="DM Sans"/>
@@ -1029,7 +1029,7 @@
         <w:keepNext/>
         <w:spacing w:after="0" w:before="200"/>
       </w:pPr>
-      <w:hyperlink w:history="1" r:id="rIdu8p9zstknmdjcqyodtqkc">
+      <w:hyperlink w:history="1" r:id="rId87nur2trtc2a0v-m8gd1e">
         <w:r>
           <w:rPr>
             <w:rFonts w:ascii="DM Sans" w:cs="DM Sans" w:eastAsia="DM Sans" w:hAnsi="DM Sans"/>
@@ -1240,7 +1240,7 @@
         <w:keepNext/>
         <w:spacing w:after="0" w:before="200"/>
       </w:pPr>
-      <w:hyperlink w:history="1" r:id="rIdv85qbfqhzev8mtuac47je">
+      <w:hyperlink w:history="1" r:id="rIduano6dednrmocgbrrooaj">
         <w:r>
           <w:rPr>
             <w:rFonts w:ascii="DM Sans" w:cs="DM Sans" w:eastAsia="DM Sans" w:hAnsi="DM Sans"/>
@@ -1401,7 +1401,7 @@
         <w:keepNext/>
         <w:spacing w:after="0" w:before="200"/>
       </w:pPr>
-      <w:hyperlink w:history="1" r:id="rIdien7pcl5vz9wdz4snmvkf">
+      <w:hyperlink w:history="1" r:id="rIdlouy95g56jsvp9app4whs">
         <w:r>
           <w:rPr>
             <w:rFonts w:ascii="DM Sans" w:cs="DM Sans" w:eastAsia="DM Sans" w:hAnsi="DM Sans"/>
@@ -1962,7 +1962,7 @@
         <w:keepNext/>
         <w:spacing w:after="60" w:before="0"/>
       </w:pPr>
-      <w:hyperlink w:history="1" r:id="rIdigheba1wu6x_9li46i3ma">
+      <w:hyperlink w:history="1" r:id="rIdgbbzeq-jeockavjqzqye9">
         <w:r>
           <w:rPr>
             <w:rFonts w:ascii="DM Sans" w:cs="DM Sans" w:eastAsia="DM Sans" w:hAnsi="DM Sans"/>
@@ -2002,7 +2002,7 @@
         <w:keepNext/>
         <w:spacing w:after="60" w:before="200"/>
       </w:pPr>
-      <w:hyperlink w:history="1" r:id="rIdqv0mzyqkffxkqmsf7-mt5">
+      <w:hyperlink w:history="1" r:id="rIdyjukfx5fondtdy9pgowrp">
         <w:r>
           <w:rPr>
             <w:rFonts w:ascii="DM Sans" w:cs="DM Sans" w:eastAsia="DM Sans" w:hAnsi="DM Sans"/>
@@ -2172,7 +2172,7 @@
       </w:pBdr>
       <w:spacing w:after="80" w:before="40"/>
     </w:pPr>
-    <w:hyperlink w:history="1" r:id="rIdicq3zoq4kezh59gim3jiy">
+    <w:hyperlink w:history="1" r:id="rIdqfcukyc_tp2am8upyq_mc">
       <w:r>
         <w:rPr>
           <w:rFonts w:ascii="DM Sans" w:cs="DM Sans" w:eastAsia="DM Sans" w:hAnsi="DM Sans"/>
@@ -2197,7 +2197,7 @@
       </w:rPr>
       <w:t xml:space="preserve"> · </w:t>
     </w:r>
-    <w:hyperlink w:history="1" r:id="rId8rkc_srn0utuwexqpxb8z">
+    <w:hyperlink w:history="1" r:id="rIdsucegoyjhfv2aou7uymma">
       <w:r>
         <w:rPr>
           <w:rFonts w:ascii="DM Sans" w:cs="DM Sans" w:eastAsia="DM Sans" w:hAnsi="DM Sans"/>
@@ -2248,7 +2248,7 @@
       </w:rPr>
       <w:t xml:space="preserve"> · </w:t>
     </w:r>
-    <w:hyperlink w:history="1" r:id="rIdqcetpvpq4d3_m0uxhp1z7">
+    <w:hyperlink w:history="1" r:id="rIdktbdk1cgaswoi7gmm8s_m">
       <w:r>
         <w:rPr>
           <w:rFonts w:ascii="DM Sans" w:cs="DM Sans" w:eastAsia="DM Sans" w:hAnsi="DM Sans"/>
@@ -2273,7 +2273,7 @@
       </w:rPr>
       <w:t xml:space="preserve"> · </w:t>
     </w:r>
-    <w:hyperlink w:history="1" r:id="rIdehlo8bi97uks210-klqrf">
+    <w:hyperlink w:history="1" r:id="rIdfcld6smmlzgk6xwpukusy">
       <w:r>
         <w:rPr>
           <w:rFonts w:ascii="DM Sans" w:cs="DM Sans" w:eastAsia="DM Sans" w:hAnsi="DM Sans"/>
@@ -2298,7 +2298,7 @@
       </w:rPr>
       <w:t xml:space="preserve"> · </w:t>
     </w:r>
-    <w:hyperlink w:history="1" r:id="rIdqxsmp40janqk-ti3jwbba">
+    <w:hyperlink w:history="1" r:id="rId-lkyni6jkg50e1xuyo1f8">
       <w:r>
         <w:rPr>
           <w:rFonts w:ascii="DM Sans" w:cs="DM Sans" w:eastAsia="DM Sans" w:hAnsi="DM Sans"/>

</xml_diff>

<commit_message>
Update resume headline to Growth, MarTech, and Data Platform
Mirrors the LinkedIn job-title change so the site headline, the docx
exports, and the cover-letter header all match the scoped framing
recruiters search for. Regenerated the production .docx template and
PDF via npm run resume:pdf.

Co-Authored-By: Claude Opus 4.7 (1M context) <noreply@anthropic.com>
</commit_message>
<xml_diff>
--- a/public/resume/malcolm-xavier-resume-template.docx
+++ b/public/resume/malcolm-xavier-resume-template.docx
@@ -33,14 +33,14 @@
           <w:sz w:val="21"/>
           <w:szCs w:val="21"/>
         </w:rPr>
-        <w:t xml:space="preserve">Senior Product Manager · Growth and Data · Media, Publishing, and Streaming · AI-Native</w:t>
-      </w:r>
-    </w:p>
-    <w:p>
-      <w:pPr>
-        <w:spacing w:after="40" w:before="0"/>
-      </w:pPr>
-      <w:hyperlink w:history="1" r:id="rIdqw58r4kdf_rpu5yplney2">
+        <w:t xml:space="preserve">Senior Product Manager · Growth, MarTech, and Data Platform · Media, Publishing, and Streaming · AI-Native</w:t>
+      </w:r>
+    </w:p>
+    <w:p>
+      <w:pPr>
+        <w:spacing w:after="40" w:before="0"/>
+      </w:pPr>
+      <w:hyperlink w:history="1" r:id="rIdjmb4nqkypdg3n88nzkltr">
         <w:r>
           <w:rPr>
             <w:rFonts w:ascii="DM Sans" w:cs="DM Sans" w:eastAsia="DM Sans" w:hAnsi="DM Sans"/>
@@ -69,7 +69,7 @@
         </w:rPr>
         <w:t xml:space="preserve"> · </w:t>
       </w:r>
-      <w:hyperlink w:history="1" r:id="rId-3zuh2m9fi-jrvhg4axlp">
+      <w:hyperlink w:history="1" r:id="rIdbuzvb86yaahye7mgh0b1u">
         <w:r>
           <w:rPr>
             <w:rFonts w:ascii="DM Sans" w:cs="DM Sans" w:eastAsia="DM Sans" w:hAnsi="DM Sans"/>
@@ -116,7 +116,7 @@
       <w:pPr>
         <w:spacing w:after="200" w:before="0"/>
       </w:pPr>
-      <w:hyperlink w:history="1" r:id="rIdb_odfcyjwoezgmpcdslqe">
+      <w:hyperlink w:history="1" r:id="rIdimgloymmarothmsk-rg4n">
         <w:r>
           <w:rPr>
             <w:rFonts w:ascii="DM Sans" w:cs="DM Sans" w:eastAsia="DM Sans" w:hAnsi="DM Sans"/>
@@ -145,7 +145,7 @@
         </w:rPr>
         <w:t xml:space="preserve"> · </w:t>
       </w:r>
-      <w:hyperlink w:history="1" r:id="rIdiokvdf6yr4frbqls9umki">
+      <w:hyperlink w:history="1" r:id="rIdiwhpr3qe0kylypgvfttsw">
         <w:r>
           <w:rPr>
             <w:rFonts w:ascii="DM Sans" w:cs="DM Sans" w:eastAsia="DM Sans" w:hAnsi="DM Sans"/>
@@ -174,7 +174,7 @@
         </w:rPr>
         <w:t xml:space="preserve"> · </w:t>
       </w:r>
-      <w:hyperlink w:history="1" r:id="rIdhyf0vuuce8ejgsyiamq52">
+      <w:hyperlink w:history="1" r:id="rIdxs8e9mowsmjbsb5tl7eck">
         <w:r>
           <w:rPr>
             <w:rFonts w:ascii="DM Sans" w:cs="DM Sans" w:eastAsia="DM Sans" w:hAnsi="DM Sans"/>
@@ -235,7 +235,7 @@
         <w:keepNext/>
         <w:spacing w:after="0" w:before="0"/>
       </w:pPr>
-      <w:hyperlink w:history="1" r:id="rIdwttqzvxtpk5wqau6bqnco">
+      <w:hyperlink w:history="1" r:id="rIdp9xtasmeu66kva5zurtzs">
         <w:r>
           <w:rPr>
             <w:rFonts w:ascii="DM Sans" w:cs="DM Sans" w:eastAsia="DM Sans" w:hAnsi="DM Sans"/>
@@ -281,7 +281,7 @@
           <w:sz w:val="21"/>
           <w:szCs w:val="21"/>
         </w:rPr>
-        <w:t xml:space="preserve">Senior Product Manager, Audience Relationships</w:t>
+        <w:t xml:space="preserve">Senior Product Manager, Audience Relationships (Growth, MarTech, and Data Platform)</w:t>
       </w:r>
       <w:r>
         <w:rPr>
@@ -653,7 +653,7 @@
         <w:keepNext/>
         <w:spacing w:after="0" w:before="200"/>
       </w:pPr>
-      <w:hyperlink w:history="1" r:id="rIdnmrji73a9vn-cb3snay-o">
+      <w:hyperlink w:history="1" r:id="rIdmydkazofdvfnuvz0olmh8">
         <w:r>
           <w:rPr>
             <w:rFonts w:ascii="DM Sans" w:cs="DM Sans" w:eastAsia="DM Sans" w:hAnsi="DM Sans"/>
@@ -965,7 +965,7 @@
         </w:rPr>
         <w:t xml:space="preserve">Product consulting for </w:t>
       </w:r>
-      <w:hyperlink w:history="1" r:id="rIdztr-d2whph5x1xvciv2o8">
+      <w:hyperlink w:history="1" r:id="rIdrxcbquikf8zx72pu9dlsp">
         <w:r>
           <w:rPr>
             <w:rFonts w:ascii="DM Sans" w:cs="DM Sans" w:eastAsia="DM Sans" w:hAnsi="DM Sans"/>
@@ -994,7 +994,7 @@
         </w:rPr>
         <w:t xml:space="preserve"> (SaaS, music industry); developed content strategy for </w:t>
       </w:r>
-      <w:hyperlink w:history="1" r:id="rIdsiftwpz4dvaiizd7cuqlz">
+      <w:hyperlink w:history="1" r:id="rIdjxh7xxudxyugsdazokgxp">
         <w:r>
           <w:rPr>
             <w:rFonts w:ascii="DM Sans" w:cs="DM Sans" w:eastAsia="DM Sans" w:hAnsi="DM Sans"/>
@@ -1029,7 +1029,7 @@
         <w:keepNext/>
         <w:spacing w:after="0" w:before="200"/>
       </w:pPr>
-      <w:hyperlink w:history="1" r:id="rId87nur2trtc2a0v-m8gd1e">
+      <w:hyperlink w:history="1" r:id="rIduhpat8psgx04h9iontrb0">
         <w:r>
           <w:rPr>
             <w:rFonts w:ascii="DM Sans" w:cs="DM Sans" w:eastAsia="DM Sans" w:hAnsi="DM Sans"/>
@@ -1240,7 +1240,7 @@
         <w:keepNext/>
         <w:spacing w:after="0" w:before="200"/>
       </w:pPr>
-      <w:hyperlink w:history="1" r:id="rIduano6dednrmocgbrrooaj">
+      <w:hyperlink w:history="1" r:id="rIdwahe7jiig8izxtzu0g1qj">
         <w:r>
           <w:rPr>
             <w:rFonts w:ascii="DM Sans" w:cs="DM Sans" w:eastAsia="DM Sans" w:hAnsi="DM Sans"/>
@@ -1286,7 +1286,7 @@
           <w:sz w:val="21"/>
           <w:szCs w:val="21"/>
         </w:rPr>
-        <w:t xml:space="preserve">Admissions Lead (Project Manager)</w:t>
+        <w:t xml:space="preserve">Admissions Lead, Project Manager</w:t>
       </w:r>
       <w:r>
         <w:rPr>
@@ -1401,7 +1401,7 @@
         <w:keepNext/>
         <w:spacing w:after="0" w:before="200"/>
       </w:pPr>
-      <w:hyperlink w:history="1" r:id="rIdlouy95g56jsvp9app4whs">
+      <w:hyperlink w:history="1" r:id="rIdkgjsubxrf7f4pun_zrqa9">
         <w:r>
           <w:rPr>
             <w:rFonts w:ascii="DM Sans" w:cs="DM Sans" w:eastAsia="DM Sans" w:hAnsi="DM Sans"/>
@@ -1962,7 +1962,7 @@
         <w:keepNext/>
         <w:spacing w:after="60" w:before="0"/>
       </w:pPr>
-      <w:hyperlink w:history="1" r:id="rIdgbbzeq-jeockavjqzqye9">
+      <w:hyperlink w:history="1" r:id="rIddho3ffikyf8qs04gkjqul">
         <w:r>
           <w:rPr>
             <w:rFonts w:ascii="DM Sans" w:cs="DM Sans" w:eastAsia="DM Sans" w:hAnsi="DM Sans"/>
@@ -2002,7 +2002,7 @@
         <w:keepNext/>
         <w:spacing w:after="60" w:before="200"/>
       </w:pPr>
-      <w:hyperlink w:history="1" r:id="rIdyjukfx5fondtdy9pgowrp">
+      <w:hyperlink w:history="1" r:id="rIdenmeui6h2dqxk-rgy5-0w">
         <w:r>
           <w:rPr>
             <w:rFonts w:ascii="DM Sans" w:cs="DM Sans" w:eastAsia="DM Sans" w:hAnsi="DM Sans"/>
@@ -2162,7 +2162,7 @@
         <w:sz w:val="18"/>
         <w:szCs w:val="18"/>
       </w:rPr>
-      <w:t xml:space="preserve">Senior Product Manager · Growth and Data · Media, Publishing, and Streaming · AI-Native</w:t>
+      <w:t xml:space="preserve">Senior Product Manager · Growth, MarTech, and Data Platform · Media, Publishing, and Streaming · AI-Native</w:t>
     </w:r>
   </w:p>
   <w:p>
@@ -2172,7 +2172,7 @@
       </w:pBdr>
       <w:spacing w:after="80" w:before="40"/>
     </w:pPr>
-    <w:hyperlink w:history="1" r:id="rIdqfcukyc_tp2am8upyq_mc">
+    <w:hyperlink w:history="1" r:id="rIdamkowjevccqqap5g0twa8">
       <w:r>
         <w:rPr>
           <w:rFonts w:ascii="DM Sans" w:cs="DM Sans" w:eastAsia="DM Sans" w:hAnsi="DM Sans"/>
@@ -2197,7 +2197,7 @@
       </w:rPr>
       <w:t xml:space="preserve"> · </w:t>
     </w:r>
-    <w:hyperlink w:history="1" r:id="rIdsucegoyjhfv2aou7uymma">
+    <w:hyperlink w:history="1" r:id="rIdfg0kn8lt6-ai2rn7jlmh8">
       <w:r>
         <w:rPr>
           <w:rFonts w:ascii="DM Sans" w:cs="DM Sans" w:eastAsia="DM Sans" w:hAnsi="DM Sans"/>
@@ -2248,7 +2248,7 @@
       </w:rPr>
       <w:t xml:space="preserve"> · </w:t>
     </w:r>
-    <w:hyperlink w:history="1" r:id="rIdktbdk1cgaswoi7gmm8s_m">
+    <w:hyperlink w:history="1" r:id="rId0z4meshg6hkivqhv3lcep">
       <w:r>
         <w:rPr>
           <w:rFonts w:ascii="DM Sans" w:cs="DM Sans" w:eastAsia="DM Sans" w:hAnsi="DM Sans"/>
@@ -2273,7 +2273,7 @@
       </w:rPr>
       <w:t xml:space="preserve"> · </w:t>
     </w:r>
-    <w:hyperlink w:history="1" r:id="rIdfcld6smmlzgk6xwpukusy">
+    <w:hyperlink w:history="1" r:id="rIdyjfan0s-b3kxtmka0pesj">
       <w:r>
         <w:rPr>
           <w:rFonts w:ascii="DM Sans" w:cs="DM Sans" w:eastAsia="DM Sans" w:hAnsi="DM Sans"/>
@@ -2298,7 +2298,7 @@
       </w:rPr>
       <w:t xml:space="preserve"> · </w:t>
     </w:r>
-    <w:hyperlink w:history="1" r:id="rId-lkyni6jkg50e1xuyo1f8">
+    <w:hyperlink w:history="1" r:id="rIddpwy5dabezd9fiduwbm7p">
       <w:r>
         <w:rPr>
           <w:rFonts w:ascii="DM Sans" w:cs="DM Sans" w:eastAsia="DM Sans" w:hAnsi="DM Sans"/>

</xml_diff>

<commit_message>
Tighten resume headline and revert role-title parenthetical
The scope parenthetical was a LinkedIn-search optimization that read
fine in a search index but pushed every line to two lines on the
printed resume and /resume page. Reverted on the resume; LinkedIn
keeps the keyword version.

Headline tightened to "Growth and Data Platform" — drops MarTech
(implicit in the People Inc. context line) to keep the line from
wrapping. Regenerated .docx and PDF.

Co-Authored-By: Claude Opus 4.7 (1M context) <noreply@anthropic.com>
</commit_message>
<xml_diff>
--- a/public/resume/malcolm-xavier-resume-template.docx
+++ b/public/resume/malcolm-xavier-resume-template.docx
@@ -33,14 +33,14 @@
           <w:sz w:val="21"/>
           <w:szCs w:val="21"/>
         </w:rPr>
-        <w:t xml:space="preserve">Senior Product Manager · Growth, MarTech, and Data Platform · Media, Publishing, and Streaming · AI-Native</w:t>
-      </w:r>
-    </w:p>
-    <w:p>
-      <w:pPr>
-        <w:spacing w:after="40" w:before="0"/>
-      </w:pPr>
-      <w:hyperlink w:history="1" r:id="rIdjmb4nqkypdg3n88nzkltr">
+        <w:t xml:space="preserve">Senior Product Manager · Growth and Data Platform · Media, Publishing, and Streaming · AI-Native</w:t>
+      </w:r>
+    </w:p>
+    <w:p>
+      <w:pPr>
+        <w:spacing w:after="40" w:before="0"/>
+      </w:pPr>
+      <w:hyperlink w:history="1" r:id="rIdzcr5ppq2jianw9p0pyylo">
         <w:r>
           <w:rPr>
             <w:rFonts w:ascii="DM Sans" w:cs="DM Sans" w:eastAsia="DM Sans" w:hAnsi="DM Sans"/>
@@ -69,7 +69,7 @@
         </w:rPr>
         <w:t xml:space="preserve"> · </w:t>
       </w:r>
-      <w:hyperlink w:history="1" r:id="rIdbuzvb86yaahye7mgh0b1u">
+      <w:hyperlink w:history="1" r:id="rIdhk0_qyoqcfvucl9irqt-6">
         <w:r>
           <w:rPr>
             <w:rFonts w:ascii="DM Sans" w:cs="DM Sans" w:eastAsia="DM Sans" w:hAnsi="DM Sans"/>
@@ -116,7 +116,7 @@
       <w:pPr>
         <w:spacing w:after="200" w:before="0"/>
       </w:pPr>
-      <w:hyperlink w:history="1" r:id="rIdimgloymmarothmsk-rg4n">
+      <w:hyperlink w:history="1" r:id="rId4k-nybskghrjb8sgbsner">
         <w:r>
           <w:rPr>
             <w:rFonts w:ascii="DM Sans" w:cs="DM Sans" w:eastAsia="DM Sans" w:hAnsi="DM Sans"/>
@@ -145,7 +145,7 @@
         </w:rPr>
         <w:t xml:space="preserve"> · </w:t>
       </w:r>
-      <w:hyperlink w:history="1" r:id="rIdiwhpr3qe0kylypgvfttsw">
+      <w:hyperlink w:history="1" r:id="rIdkzy7pzu3l5webkou8hwv2">
         <w:r>
           <w:rPr>
             <w:rFonts w:ascii="DM Sans" w:cs="DM Sans" w:eastAsia="DM Sans" w:hAnsi="DM Sans"/>
@@ -174,7 +174,7 @@
         </w:rPr>
         <w:t xml:space="preserve"> · </w:t>
       </w:r>
-      <w:hyperlink w:history="1" r:id="rIdxs8e9mowsmjbsb5tl7eck">
+      <w:hyperlink w:history="1" r:id="rIdi08bbgwt_lxit2ggkix5s">
         <w:r>
           <w:rPr>
             <w:rFonts w:ascii="DM Sans" w:cs="DM Sans" w:eastAsia="DM Sans" w:hAnsi="DM Sans"/>
@@ -235,7 +235,7 @@
         <w:keepNext/>
         <w:spacing w:after="0" w:before="0"/>
       </w:pPr>
-      <w:hyperlink w:history="1" r:id="rIdp9xtasmeu66kva5zurtzs">
+      <w:hyperlink w:history="1" r:id="rIdvjexweuzfjo7ee4p_sal1">
         <w:r>
           <w:rPr>
             <w:rFonts w:ascii="DM Sans" w:cs="DM Sans" w:eastAsia="DM Sans" w:hAnsi="DM Sans"/>
@@ -281,7 +281,7 @@
           <w:sz w:val="21"/>
           <w:szCs w:val="21"/>
         </w:rPr>
-        <w:t xml:space="preserve">Senior Product Manager, Audience Relationships (Growth, MarTech, and Data Platform)</w:t>
+        <w:t xml:space="preserve">Senior Product Manager, Audience Relationships</w:t>
       </w:r>
       <w:r>
         <w:rPr>
@@ -653,7 +653,7 @@
         <w:keepNext/>
         <w:spacing w:after="0" w:before="200"/>
       </w:pPr>
-      <w:hyperlink w:history="1" r:id="rIdmydkazofdvfnuvz0olmh8">
+      <w:hyperlink w:history="1" r:id="rIdkyixtanxdd2utpl_cvifa">
         <w:r>
           <w:rPr>
             <w:rFonts w:ascii="DM Sans" w:cs="DM Sans" w:eastAsia="DM Sans" w:hAnsi="DM Sans"/>
@@ -965,7 +965,7 @@
         </w:rPr>
         <w:t xml:space="preserve">Product consulting for </w:t>
       </w:r>
-      <w:hyperlink w:history="1" r:id="rIdrxcbquikf8zx72pu9dlsp">
+      <w:hyperlink w:history="1" r:id="rIdy8jgd-m-1zcvnoupvhupw">
         <w:r>
           <w:rPr>
             <w:rFonts w:ascii="DM Sans" w:cs="DM Sans" w:eastAsia="DM Sans" w:hAnsi="DM Sans"/>
@@ -994,7 +994,7 @@
         </w:rPr>
         <w:t xml:space="preserve"> (SaaS, music industry); developed content strategy for </w:t>
       </w:r>
-      <w:hyperlink w:history="1" r:id="rIdjxh7xxudxyugsdazokgxp">
+      <w:hyperlink w:history="1" r:id="rId1hxesgnwxdqqi0sifhuf_">
         <w:r>
           <w:rPr>
             <w:rFonts w:ascii="DM Sans" w:cs="DM Sans" w:eastAsia="DM Sans" w:hAnsi="DM Sans"/>
@@ -1029,7 +1029,7 @@
         <w:keepNext/>
         <w:spacing w:after="0" w:before="200"/>
       </w:pPr>
-      <w:hyperlink w:history="1" r:id="rIduhpat8psgx04h9iontrb0">
+      <w:hyperlink w:history="1" r:id="rIdsktdtfpfzqn_v5bsd-oh7">
         <w:r>
           <w:rPr>
             <w:rFonts w:ascii="DM Sans" w:cs="DM Sans" w:eastAsia="DM Sans" w:hAnsi="DM Sans"/>
@@ -1240,7 +1240,7 @@
         <w:keepNext/>
         <w:spacing w:after="0" w:before="200"/>
       </w:pPr>
-      <w:hyperlink w:history="1" r:id="rIdwahe7jiig8izxtzu0g1qj">
+      <w:hyperlink w:history="1" r:id="rIdxxebzwbt5nlnrgnikpfhf">
         <w:r>
           <w:rPr>
             <w:rFonts w:ascii="DM Sans" w:cs="DM Sans" w:eastAsia="DM Sans" w:hAnsi="DM Sans"/>
@@ -1401,7 +1401,7 @@
         <w:keepNext/>
         <w:spacing w:after="0" w:before="200"/>
       </w:pPr>
-      <w:hyperlink w:history="1" r:id="rIdkgjsubxrf7f4pun_zrqa9">
+      <w:hyperlink w:history="1" r:id="rIdhxnvk5aw64ih5jztkk6te">
         <w:r>
           <w:rPr>
             <w:rFonts w:ascii="DM Sans" w:cs="DM Sans" w:eastAsia="DM Sans" w:hAnsi="DM Sans"/>
@@ -1962,7 +1962,7 @@
         <w:keepNext/>
         <w:spacing w:after="60" w:before="0"/>
       </w:pPr>
-      <w:hyperlink w:history="1" r:id="rIddho3ffikyf8qs04gkjqul">
+      <w:hyperlink w:history="1" r:id="rIdnf0it0tvadsdlwkmxlwr2">
         <w:r>
           <w:rPr>
             <w:rFonts w:ascii="DM Sans" w:cs="DM Sans" w:eastAsia="DM Sans" w:hAnsi="DM Sans"/>
@@ -2002,7 +2002,7 @@
         <w:keepNext/>
         <w:spacing w:after="60" w:before="200"/>
       </w:pPr>
-      <w:hyperlink w:history="1" r:id="rIdenmeui6h2dqxk-rgy5-0w">
+      <w:hyperlink w:history="1" r:id="rIdgeqznqhickyg_hvfmxdeb">
         <w:r>
           <w:rPr>
             <w:rFonts w:ascii="DM Sans" w:cs="DM Sans" w:eastAsia="DM Sans" w:hAnsi="DM Sans"/>
@@ -2162,7 +2162,7 @@
         <w:sz w:val="18"/>
         <w:szCs w:val="18"/>
       </w:rPr>
-      <w:t xml:space="preserve">Senior Product Manager · Growth, MarTech, and Data Platform · Media, Publishing, and Streaming · AI-Native</w:t>
+      <w:t xml:space="preserve">Senior Product Manager · Growth and Data Platform · Media, Publishing, and Streaming · AI-Native</w:t>
     </w:r>
   </w:p>
   <w:p>
@@ -2172,7 +2172,7 @@
       </w:pBdr>
       <w:spacing w:after="80" w:before="40"/>
     </w:pPr>
-    <w:hyperlink w:history="1" r:id="rIdamkowjevccqqap5g0twa8">
+    <w:hyperlink w:history="1" r:id="rIdvcchbreyolgf9uetdl2qm">
       <w:r>
         <w:rPr>
           <w:rFonts w:ascii="DM Sans" w:cs="DM Sans" w:eastAsia="DM Sans" w:hAnsi="DM Sans"/>
@@ -2197,7 +2197,7 @@
       </w:rPr>
       <w:t xml:space="preserve"> · </w:t>
     </w:r>
-    <w:hyperlink w:history="1" r:id="rIdfg0kn8lt6-ai2rn7jlmh8">
+    <w:hyperlink w:history="1" r:id="rIduxu6ea6bbciv3flpwjlql">
       <w:r>
         <w:rPr>
           <w:rFonts w:ascii="DM Sans" w:cs="DM Sans" w:eastAsia="DM Sans" w:hAnsi="DM Sans"/>
@@ -2248,7 +2248,7 @@
       </w:rPr>
       <w:t xml:space="preserve"> · </w:t>
     </w:r>
-    <w:hyperlink w:history="1" r:id="rId0z4meshg6hkivqhv3lcep">
+    <w:hyperlink w:history="1" r:id="rIdjiiplzeeyfacpcpsfowjo">
       <w:r>
         <w:rPr>
           <w:rFonts w:ascii="DM Sans" w:cs="DM Sans" w:eastAsia="DM Sans" w:hAnsi="DM Sans"/>
@@ -2273,7 +2273,7 @@
       </w:rPr>
       <w:t xml:space="preserve"> · </w:t>
     </w:r>
-    <w:hyperlink w:history="1" r:id="rIdyjfan0s-b3kxtmka0pesj">
+    <w:hyperlink w:history="1" r:id="rIdzhk3kd1l_dghgxr2togfj">
       <w:r>
         <w:rPr>
           <w:rFonts w:ascii="DM Sans" w:cs="DM Sans" w:eastAsia="DM Sans" w:hAnsi="DM Sans"/>
@@ -2298,7 +2298,7 @@
       </w:rPr>
       <w:t xml:space="preserve"> · </w:t>
     </w:r>
-    <w:hyperlink w:history="1" r:id="rIddpwy5dabezd9fiduwbm7p">
+    <w:hyperlink w:history="1" r:id="rIdruci2_oqja8uhqikqu86e">
       <w:r>
         <w:rPr>
           <w:rFonts w:ascii="DM Sans" w:cs="DM Sans" w:eastAsia="DM Sans" w:hAnsi="DM Sans"/>

</xml_diff>

<commit_message>
Add resume sync check and surfaces map
Adds scripts/check-resume-sync.mjs (greps shared scalar fields across
the four resume scripts and reports drift) and app/resume/SURFACES.md
(canonical map of surfaces, shared fields, and intentional divergences).
Replaces app/resume/CLAUDE.md with a leaner index pointing at
SURFACES.md, and refreshes the stale Google Docs reference in
resume-data.tsx's header comment.

First check run flagged the Muck Rack title drift — standardized
"Content & Data Ingestion" (site, docx) and "Content, Data Ingestion"
(bullet bank) to "Content and Data Ingestion" per the "and not &"
universal mechanic. Regenerated docx template and PDF.

Co-Authored-By: Claude Opus 4.7 (1M context) <noreply@anthropic.com>
</commit_message>
<xml_diff>
--- a/public/resume/malcolm-xavier-resume-template.docx
+++ b/public/resume/malcolm-xavier-resume-template.docx
@@ -40,7 +40,7 @@
       <w:pPr>
         <w:spacing w:after="40" w:before="0"/>
       </w:pPr>
-      <w:hyperlink w:history="1" r:id="rIdzcr5ppq2jianw9p0pyylo">
+      <w:hyperlink w:history="1" r:id="rIdurmtcpjhmidhbiy3lsiuy">
         <w:r>
           <w:rPr>
             <w:rFonts w:ascii="DM Sans" w:cs="DM Sans" w:eastAsia="DM Sans" w:hAnsi="DM Sans"/>
@@ -69,7 +69,7 @@
         </w:rPr>
         <w:t xml:space="preserve"> · </w:t>
       </w:r>
-      <w:hyperlink w:history="1" r:id="rIdhk0_qyoqcfvucl9irqt-6">
+      <w:hyperlink w:history="1" r:id="rIdzabg-joii53luxxynros4">
         <w:r>
           <w:rPr>
             <w:rFonts w:ascii="DM Sans" w:cs="DM Sans" w:eastAsia="DM Sans" w:hAnsi="DM Sans"/>
@@ -116,7 +116,7 @@
       <w:pPr>
         <w:spacing w:after="200" w:before="0"/>
       </w:pPr>
-      <w:hyperlink w:history="1" r:id="rId4k-nybskghrjb8sgbsner">
+      <w:hyperlink w:history="1" r:id="rIdqat605bztsbthu2s5pzay">
         <w:r>
           <w:rPr>
             <w:rFonts w:ascii="DM Sans" w:cs="DM Sans" w:eastAsia="DM Sans" w:hAnsi="DM Sans"/>
@@ -145,7 +145,7 @@
         </w:rPr>
         <w:t xml:space="preserve"> · </w:t>
       </w:r>
-      <w:hyperlink w:history="1" r:id="rIdkzy7pzu3l5webkou8hwv2">
+      <w:hyperlink w:history="1" r:id="rIdpdgphmadvx6b8fp3tscdy">
         <w:r>
           <w:rPr>
             <w:rFonts w:ascii="DM Sans" w:cs="DM Sans" w:eastAsia="DM Sans" w:hAnsi="DM Sans"/>
@@ -174,7 +174,7 @@
         </w:rPr>
         <w:t xml:space="preserve"> · </w:t>
       </w:r>
-      <w:hyperlink w:history="1" r:id="rIdi08bbgwt_lxit2ggkix5s">
+      <w:hyperlink w:history="1" r:id="rIdrggnmgr6ywcvgtjxden0q">
         <w:r>
           <w:rPr>
             <w:rFonts w:ascii="DM Sans" w:cs="DM Sans" w:eastAsia="DM Sans" w:hAnsi="DM Sans"/>
@@ -235,7 +235,7 @@
         <w:keepNext/>
         <w:spacing w:after="0" w:before="0"/>
       </w:pPr>
-      <w:hyperlink w:history="1" r:id="rIdvjexweuzfjo7ee4p_sal1">
+      <w:hyperlink w:history="1" r:id="rIdaq4ryu10ew4ffhns4az9_">
         <w:r>
           <w:rPr>
             <w:rFonts w:ascii="DM Sans" w:cs="DM Sans" w:eastAsia="DM Sans" w:hAnsi="DM Sans"/>
@@ -653,7 +653,7 @@
         <w:keepNext/>
         <w:spacing w:after="0" w:before="200"/>
       </w:pPr>
-      <w:hyperlink w:history="1" r:id="rIdkyixtanxdd2utpl_cvifa">
+      <w:hyperlink w:history="1" r:id="rIdfrpmyw_xkw0eyyfkvzcqg">
         <w:r>
           <w:rPr>
             <w:rFonts w:ascii="DM Sans" w:cs="DM Sans" w:eastAsia="DM Sans" w:hAnsi="DM Sans"/>
@@ -699,7 +699,7 @@
           <w:sz w:val="21"/>
           <w:szCs w:val="21"/>
         </w:rPr>
-        <w:t xml:space="preserve">Technical Product Manager, Content &amp; Data Ingestion</w:t>
+        <w:t xml:space="preserve">Technical Product Manager, Content and Data Ingestion</w:t>
       </w:r>
       <w:r>
         <w:rPr>
@@ -965,7 +965,7 @@
         </w:rPr>
         <w:t xml:space="preserve">Product consulting for </w:t>
       </w:r>
-      <w:hyperlink w:history="1" r:id="rIdy8jgd-m-1zcvnoupvhupw">
+      <w:hyperlink w:history="1" r:id="rIdxrywvlej89qvqjavadmfi">
         <w:r>
           <w:rPr>
             <w:rFonts w:ascii="DM Sans" w:cs="DM Sans" w:eastAsia="DM Sans" w:hAnsi="DM Sans"/>
@@ -994,7 +994,7 @@
         </w:rPr>
         <w:t xml:space="preserve"> (SaaS, music industry); developed content strategy for </w:t>
       </w:r>
-      <w:hyperlink w:history="1" r:id="rId1hxesgnwxdqqi0sifhuf_">
+      <w:hyperlink w:history="1" r:id="rId3jb2vwxwdltfywdbbex34">
         <w:r>
           <w:rPr>
             <w:rFonts w:ascii="DM Sans" w:cs="DM Sans" w:eastAsia="DM Sans" w:hAnsi="DM Sans"/>
@@ -1029,7 +1029,7 @@
         <w:keepNext/>
         <w:spacing w:after="0" w:before="200"/>
       </w:pPr>
-      <w:hyperlink w:history="1" r:id="rIdsktdtfpfzqn_v5bsd-oh7">
+      <w:hyperlink w:history="1" r:id="rIdc5ma1q7ntwzjvax_fzhgg">
         <w:r>
           <w:rPr>
             <w:rFonts w:ascii="DM Sans" w:cs="DM Sans" w:eastAsia="DM Sans" w:hAnsi="DM Sans"/>
@@ -1240,7 +1240,7 @@
         <w:keepNext/>
         <w:spacing w:after="0" w:before="200"/>
       </w:pPr>
-      <w:hyperlink w:history="1" r:id="rIdxxebzwbt5nlnrgnikpfhf">
+      <w:hyperlink w:history="1" r:id="rIdnmert8d055gd6hjsm2ntv">
         <w:r>
           <w:rPr>
             <w:rFonts w:ascii="DM Sans" w:cs="DM Sans" w:eastAsia="DM Sans" w:hAnsi="DM Sans"/>
@@ -1401,7 +1401,7 @@
         <w:keepNext/>
         <w:spacing w:after="0" w:before="200"/>
       </w:pPr>
-      <w:hyperlink w:history="1" r:id="rIdhxnvk5aw64ih5jztkk6te">
+      <w:hyperlink w:history="1" r:id="rIdeqtbrgppdh8j1179hlpvg">
         <w:r>
           <w:rPr>
             <w:rFonts w:ascii="DM Sans" w:cs="DM Sans" w:eastAsia="DM Sans" w:hAnsi="DM Sans"/>
@@ -1962,7 +1962,7 @@
         <w:keepNext/>
         <w:spacing w:after="60" w:before="0"/>
       </w:pPr>
-      <w:hyperlink w:history="1" r:id="rIdnf0it0tvadsdlwkmxlwr2">
+      <w:hyperlink w:history="1" r:id="rIdsbdmp1cuifqobqo9clkef">
         <w:r>
           <w:rPr>
             <w:rFonts w:ascii="DM Sans" w:cs="DM Sans" w:eastAsia="DM Sans" w:hAnsi="DM Sans"/>
@@ -2002,7 +2002,7 @@
         <w:keepNext/>
         <w:spacing w:after="60" w:before="200"/>
       </w:pPr>
-      <w:hyperlink w:history="1" r:id="rIdgeqznqhickyg_hvfmxdeb">
+      <w:hyperlink w:history="1" r:id="rId_iuxzxcd5j5hk2hqdl2qr">
         <w:r>
           <w:rPr>
             <w:rFonts w:ascii="DM Sans" w:cs="DM Sans" w:eastAsia="DM Sans" w:hAnsi="DM Sans"/>
@@ -2172,7 +2172,7 @@
       </w:pBdr>
       <w:spacing w:after="80" w:before="40"/>
     </w:pPr>
-    <w:hyperlink w:history="1" r:id="rIdvcchbreyolgf9uetdl2qm">
+    <w:hyperlink w:history="1" r:id="rIdtj1xe1t-tkdam7bwvn6rh">
       <w:r>
         <w:rPr>
           <w:rFonts w:ascii="DM Sans" w:cs="DM Sans" w:eastAsia="DM Sans" w:hAnsi="DM Sans"/>
@@ -2197,7 +2197,7 @@
       </w:rPr>
       <w:t xml:space="preserve"> · </w:t>
     </w:r>
-    <w:hyperlink w:history="1" r:id="rIduxu6ea6bbciv3flpwjlql">
+    <w:hyperlink w:history="1" r:id="rIdmru2jhy5crsq01waoxngm">
       <w:r>
         <w:rPr>
           <w:rFonts w:ascii="DM Sans" w:cs="DM Sans" w:eastAsia="DM Sans" w:hAnsi="DM Sans"/>
@@ -2248,7 +2248,7 @@
       </w:rPr>
       <w:t xml:space="preserve"> · </w:t>
     </w:r>
-    <w:hyperlink w:history="1" r:id="rIdjiiplzeeyfacpcpsfowjo">
+    <w:hyperlink w:history="1" r:id="rIdjwersjcddd1jjjskdljem">
       <w:r>
         <w:rPr>
           <w:rFonts w:ascii="DM Sans" w:cs="DM Sans" w:eastAsia="DM Sans" w:hAnsi="DM Sans"/>
@@ -2273,7 +2273,7 @@
       </w:rPr>
       <w:t xml:space="preserve"> · </w:t>
     </w:r>
-    <w:hyperlink w:history="1" r:id="rIdzhk3kd1l_dghgxr2togfj">
+    <w:hyperlink w:history="1" r:id="rId6pfurzvqagmlypqirb_ek">
       <w:r>
         <w:rPr>
           <w:rFonts w:ascii="DM Sans" w:cs="DM Sans" w:eastAsia="DM Sans" w:hAnsi="DM Sans"/>
@@ -2298,7 +2298,7 @@
       </w:rPr>
       <w:t xml:space="preserve"> · </w:t>
     </w:r>
-    <w:hyperlink w:history="1" r:id="rIdruci2_oqja8uhqikqu86e">
+    <w:hyperlink w:history="1" r:id="rIdl9tebyun3qxp1x2pffasb">
       <w:r>
         <w:rPr>
           <w:rFonts w:ascii="DM Sans" w:cs="DM Sans" w:eastAsia="DM Sans" w:hAnsi="DM Sans"/>

</xml_diff>

<commit_message>
Curate case study surfaces independently across /resume and docx
Carousel on /resume now filters by !employer, so future work case
studies appear only via per-role relatedCaseStudies footer links —
not double-surfaced in the carousel. Current behavior unchanged
(all three existing studies are non-work).

Docx Case Studies section swaps basecamp-coffee for
architecture-under-contract. The PDF is page-bound and ATS-bound;
two denser senior-PM signal entries serve recruiters better than
three of mixed weight. Carousel keeps basecamp-coffee since the
website has room and the study earns its slot on the standalone-
product axis.

SURFACES.md documents the case study surface rules (carousel,
role footer, /case-studies index, docx) and the intentional
curation divergence between the carousel and the docx list.

Co-Authored-By: Claude Opus 4.7 (1M context) <noreply@anthropic.com>
</commit_message>
<xml_diff>
--- a/public/resume/malcolm-xavier-resume-template.docx
+++ b/public/resume/malcolm-xavier-resume-template.docx
@@ -40,7 +40,7 @@
       <w:pPr>
         <w:spacing w:after="40" w:before="0"/>
       </w:pPr>
-      <w:hyperlink w:history="1" r:id="rIdurmtcpjhmidhbiy3lsiuy">
+      <w:hyperlink w:history="1" r:id="rIddedwsxprtfn1ywljxyrjm">
         <w:r>
           <w:rPr>
             <w:rFonts w:ascii="DM Sans" w:cs="DM Sans" w:eastAsia="DM Sans" w:hAnsi="DM Sans"/>
@@ -69,7 +69,7 @@
         </w:rPr>
         <w:t xml:space="preserve"> · </w:t>
       </w:r>
-      <w:hyperlink w:history="1" r:id="rIdzabg-joii53luxxynros4">
+      <w:hyperlink w:history="1" r:id="rId5ikzo1zo83xuiv86mtwhc">
         <w:r>
           <w:rPr>
             <w:rFonts w:ascii="DM Sans" w:cs="DM Sans" w:eastAsia="DM Sans" w:hAnsi="DM Sans"/>
@@ -116,7 +116,7 @@
       <w:pPr>
         <w:spacing w:after="200" w:before="0"/>
       </w:pPr>
-      <w:hyperlink w:history="1" r:id="rIdqat605bztsbthu2s5pzay">
+      <w:hyperlink w:history="1" r:id="rIdqc8mpgs69081mpbhytliz">
         <w:r>
           <w:rPr>
             <w:rFonts w:ascii="DM Sans" w:cs="DM Sans" w:eastAsia="DM Sans" w:hAnsi="DM Sans"/>
@@ -145,7 +145,7 @@
         </w:rPr>
         <w:t xml:space="preserve"> · </w:t>
       </w:r>
-      <w:hyperlink w:history="1" r:id="rIdpdgphmadvx6b8fp3tscdy">
+      <w:hyperlink w:history="1" r:id="rIdf8kimhh7tumuiepzu2ulh">
         <w:r>
           <w:rPr>
             <w:rFonts w:ascii="DM Sans" w:cs="DM Sans" w:eastAsia="DM Sans" w:hAnsi="DM Sans"/>
@@ -174,7 +174,7 @@
         </w:rPr>
         <w:t xml:space="preserve"> · </w:t>
       </w:r>
-      <w:hyperlink w:history="1" r:id="rIdrggnmgr6ywcvgtjxden0q">
+      <w:hyperlink w:history="1" r:id="rIde0x9hkxs3cw8-lwp9vwlq">
         <w:r>
           <w:rPr>
             <w:rFonts w:ascii="DM Sans" w:cs="DM Sans" w:eastAsia="DM Sans" w:hAnsi="DM Sans"/>
@@ -235,7 +235,7 @@
         <w:keepNext/>
         <w:spacing w:after="0" w:before="0"/>
       </w:pPr>
-      <w:hyperlink w:history="1" r:id="rIdaq4ryu10ew4ffhns4az9_">
+      <w:hyperlink w:history="1" r:id="rIdwzxya78f9lzvgc3ojyrce">
         <w:r>
           <w:rPr>
             <w:rFonts w:ascii="DM Sans" w:cs="DM Sans" w:eastAsia="DM Sans" w:hAnsi="DM Sans"/>
@@ -653,7 +653,7 @@
         <w:keepNext/>
         <w:spacing w:after="0" w:before="200"/>
       </w:pPr>
-      <w:hyperlink w:history="1" r:id="rIdfrpmyw_xkw0eyyfkvzcqg">
+      <w:hyperlink w:history="1" r:id="rIddztug6cpxbxzhzkjn7xdu">
         <w:r>
           <w:rPr>
             <w:rFonts w:ascii="DM Sans" w:cs="DM Sans" w:eastAsia="DM Sans" w:hAnsi="DM Sans"/>
@@ -965,7 +965,7 @@
         </w:rPr>
         <w:t xml:space="preserve">Product consulting for </w:t>
       </w:r>
-      <w:hyperlink w:history="1" r:id="rIdxrywvlej89qvqjavadmfi">
+      <w:hyperlink w:history="1" r:id="rIdxgujrberotshpts9elivp">
         <w:r>
           <w:rPr>
             <w:rFonts w:ascii="DM Sans" w:cs="DM Sans" w:eastAsia="DM Sans" w:hAnsi="DM Sans"/>
@@ -994,7 +994,7 @@
         </w:rPr>
         <w:t xml:space="preserve"> (SaaS, music industry); developed content strategy for </w:t>
       </w:r>
-      <w:hyperlink w:history="1" r:id="rId3jb2vwxwdltfywdbbex34">
+      <w:hyperlink w:history="1" r:id="rIdx0ekq2lfturc98qk0imkm">
         <w:r>
           <w:rPr>
             <w:rFonts w:ascii="DM Sans" w:cs="DM Sans" w:eastAsia="DM Sans" w:hAnsi="DM Sans"/>
@@ -1029,7 +1029,7 @@
         <w:keepNext/>
         <w:spacing w:after="0" w:before="200"/>
       </w:pPr>
-      <w:hyperlink w:history="1" r:id="rIdc5ma1q7ntwzjvax_fzhgg">
+      <w:hyperlink w:history="1" r:id="rIdfciy5y4tl2b6wf1gy0mma">
         <w:r>
           <w:rPr>
             <w:rFonts w:ascii="DM Sans" w:cs="DM Sans" w:eastAsia="DM Sans" w:hAnsi="DM Sans"/>
@@ -1240,7 +1240,7 @@
         <w:keepNext/>
         <w:spacing w:after="0" w:before="200"/>
       </w:pPr>
-      <w:hyperlink w:history="1" r:id="rIdnmert8d055gd6hjsm2ntv">
+      <w:hyperlink w:history="1" r:id="rId_dvqphg0mkrvyewhaja-r">
         <w:r>
           <w:rPr>
             <w:rFonts w:ascii="DM Sans" w:cs="DM Sans" w:eastAsia="DM Sans" w:hAnsi="DM Sans"/>
@@ -1401,7 +1401,7 @@
         <w:keepNext/>
         <w:spacing w:after="0" w:before="200"/>
       </w:pPr>
-      <w:hyperlink w:history="1" r:id="rIdeqtbrgppdh8j1179hlpvg">
+      <w:hyperlink w:history="1" r:id="rIduazci_q71xprnh9z1978x">
         <w:r>
           <w:rPr>
             <w:rFonts w:ascii="DM Sans" w:cs="DM Sans" w:eastAsia="DM Sans" w:hAnsi="DM Sans"/>
@@ -1962,7 +1962,7 @@
         <w:keepNext/>
         <w:spacing w:after="60" w:before="0"/>
       </w:pPr>
-      <w:hyperlink w:history="1" r:id="rIdsbdmp1cuifqobqo9clkef">
+      <w:hyperlink w:history="1" r:id="rIdgccv4kaqyu50qal1ypjje">
         <w:r>
           <w:rPr>
             <w:rFonts w:ascii="DM Sans" w:cs="DM Sans" w:eastAsia="DM Sans" w:hAnsi="DM Sans"/>
@@ -1975,7 +1975,7 @@
             <w:szCs w:val="24"/>
             <w:u w:val="single" w:color="000000"/>
           </w:rPr>
-          <w:t xml:space="preserve">Basecamp Coffee—Find your ritual</w:t>
+          <w:t xml:space="preserve">Architecture under contract</w:t>
         </w:r>
       </w:hyperlink>
     </w:p>
@@ -1994,7 +1994,7 @@
           <w:sz w:val="21"/>
           <w:szCs w:val="21"/>
         </w:rPr>
-        <w:t xml:space="preserve">An interactive coffee-personality quiz exploring product discovery, conversational UX, and lightweight personalization for a fictional specialty roaster. Built end-to-end with Claude Code, Next.js, and Vercel.</w:t>
+        <w:t xml:space="preserve">One architectural rule that keeps three integrations online when their upstreams break. Polite-client posture for the one with no API, TMDB enrichment for two. Sequel to Building this site.</w:t>
       </w:r>
     </w:p>
     <w:p>
@@ -2002,7 +2002,7 @@
         <w:keepNext/>
         <w:spacing w:after="60" w:before="200"/>
       </w:pPr>
-      <w:hyperlink w:history="1" r:id="rId_iuxzxcd5j5hk2hqdl2qr">
+      <w:hyperlink w:history="1" r:id="rId7l3-qdklhaehpgcib9aql">
         <w:r>
           <w:rPr>
             <w:rFonts w:ascii="DM Sans" w:cs="DM Sans" w:eastAsia="DM Sans" w:hAnsi="DM Sans"/>
@@ -2172,7 +2172,7 @@
       </w:pBdr>
       <w:spacing w:after="80" w:before="40"/>
     </w:pPr>
-    <w:hyperlink w:history="1" r:id="rIdtj1xe1t-tkdam7bwvn6rh">
+    <w:hyperlink w:history="1" r:id="rId6mci_qu8aupgmku6xr6jz">
       <w:r>
         <w:rPr>
           <w:rFonts w:ascii="DM Sans" w:cs="DM Sans" w:eastAsia="DM Sans" w:hAnsi="DM Sans"/>
@@ -2197,7 +2197,7 @@
       </w:rPr>
       <w:t xml:space="preserve"> · </w:t>
     </w:r>
-    <w:hyperlink w:history="1" r:id="rIdmru2jhy5crsq01waoxngm">
+    <w:hyperlink w:history="1" r:id="rIdlwzu3ugpez1-_h1zutlvj">
       <w:r>
         <w:rPr>
           <w:rFonts w:ascii="DM Sans" w:cs="DM Sans" w:eastAsia="DM Sans" w:hAnsi="DM Sans"/>
@@ -2248,7 +2248,7 @@
       </w:rPr>
       <w:t xml:space="preserve"> · </w:t>
     </w:r>
-    <w:hyperlink w:history="1" r:id="rIdjwersjcddd1jjjskdljem">
+    <w:hyperlink w:history="1" r:id="rIdi6wq81kbsno7fcmvh3yye">
       <w:r>
         <w:rPr>
           <w:rFonts w:ascii="DM Sans" w:cs="DM Sans" w:eastAsia="DM Sans" w:hAnsi="DM Sans"/>
@@ -2273,7 +2273,7 @@
       </w:rPr>
       <w:t xml:space="preserve"> · </w:t>
     </w:r>
-    <w:hyperlink w:history="1" r:id="rId6pfurzvqagmlypqirb_ek">
+    <w:hyperlink w:history="1" r:id="rIdozht-ke9h6ahkxuukbjjk">
       <w:r>
         <w:rPr>
           <w:rFonts w:ascii="DM Sans" w:cs="DM Sans" w:eastAsia="DM Sans" w:hAnsi="DM Sans"/>
@@ -2298,7 +2298,7 @@
       </w:rPr>
       <w:t xml:space="preserve"> · </w:t>
     </w:r>
-    <w:hyperlink w:history="1" r:id="rIdl9tebyun3qxp1x2pffasb">
+    <w:hyperlink w:history="1" r:id="rIdkubvacyybf9sjhkqjqxsm">
       <w:r>
         <w:rPr>
           <w:rFonts w:ascii="DM Sans" w:cs="DM Sans" w:eastAsia="DM Sans" w:hAnsi="DM Sans"/>

</xml_diff>

<commit_message>
Reorder docx case studies and align sequel reference
Building my personal website now comes first in the resume PDF
Case Studies section so the reader gets the original before the
sequel. Updates the Architecture under contract description to
reference "building my personal website" (matching the docx
title) instead of the site-version "Building this site."

Co-Authored-By: Claude Opus 4.7 (1M context) <noreply@anthropic.com>
</commit_message>
<xml_diff>
--- a/public/resume/malcolm-xavier-resume-template.docx
+++ b/public/resume/malcolm-xavier-resume-template.docx
@@ -40,7 +40,7 @@
       <w:pPr>
         <w:spacing w:after="40" w:before="0"/>
       </w:pPr>
-      <w:hyperlink w:history="1" r:id="rIddedwsxprtfn1ywljxyrjm">
+      <w:hyperlink w:history="1" r:id="rIddmi7uejicohf4ipe4weu_">
         <w:r>
           <w:rPr>
             <w:rFonts w:ascii="DM Sans" w:cs="DM Sans" w:eastAsia="DM Sans" w:hAnsi="DM Sans"/>
@@ -69,7 +69,7 @@
         </w:rPr>
         <w:t xml:space="preserve"> · </w:t>
       </w:r>
-      <w:hyperlink w:history="1" r:id="rId5ikzo1zo83xuiv86mtwhc">
+      <w:hyperlink w:history="1" r:id="rIdgenwcyivdpb1_fu_3b1cw">
         <w:r>
           <w:rPr>
             <w:rFonts w:ascii="DM Sans" w:cs="DM Sans" w:eastAsia="DM Sans" w:hAnsi="DM Sans"/>
@@ -116,7 +116,7 @@
       <w:pPr>
         <w:spacing w:after="200" w:before="0"/>
       </w:pPr>
-      <w:hyperlink w:history="1" r:id="rIdqc8mpgs69081mpbhytliz">
+      <w:hyperlink w:history="1" r:id="rId3oexyyi_zajhaznkd3evn">
         <w:r>
           <w:rPr>
             <w:rFonts w:ascii="DM Sans" w:cs="DM Sans" w:eastAsia="DM Sans" w:hAnsi="DM Sans"/>
@@ -145,7 +145,7 @@
         </w:rPr>
         <w:t xml:space="preserve"> · </w:t>
       </w:r>
-      <w:hyperlink w:history="1" r:id="rIdf8kimhh7tumuiepzu2ulh">
+      <w:hyperlink w:history="1" r:id="rIdlyzhf__x7c3o2mrvpn0g7">
         <w:r>
           <w:rPr>
             <w:rFonts w:ascii="DM Sans" w:cs="DM Sans" w:eastAsia="DM Sans" w:hAnsi="DM Sans"/>
@@ -174,7 +174,7 @@
         </w:rPr>
         <w:t xml:space="preserve"> · </w:t>
       </w:r>
-      <w:hyperlink w:history="1" r:id="rIde0x9hkxs3cw8-lwp9vwlq">
+      <w:hyperlink w:history="1" r:id="rIdtwjc66jwagqw3lnisbfoc">
         <w:r>
           <w:rPr>
             <w:rFonts w:ascii="DM Sans" w:cs="DM Sans" w:eastAsia="DM Sans" w:hAnsi="DM Sans"/>
@@ -235,7 +235,7 @@
         <w:keepNext/>
         <w:spacing w:after="0" w:before="0"/>
       </w:pPr>
-      <w:hyperlink w:history="1" r:id="rIdwzxya78f9lzvgc3ojyrce">
+      <w:hyperlink w:history="1" r:id="rIdh2ebl82vbe-f6lbqyfwo3">
         <w:r>
           <w:rPr>
             <w:rFonts w:ascii="DM Sans" w:cs="DM Sans" w:eastAsia="DM Sans" w:hAnsi="DM Sans"/>
@@ -653,7 +653,7 @@
         <w:keepNext/>
         <w:spacing w:after="0" w:before="200"/>
       </w:pPr>
-      <w:hyperlink w:history="1" r:id="rIddztug6cpxbxzhzkjn7xdu">
+      <w:hyperlink w:history="1" r:id="rId8cfc1hlz4pyyul9bltbum">
         <w:r>
           <w:rPr>
             <w:rFonts w:ascii="DM Sans" w:cs="DM Sans" w:eastAsia="DM Sans" w:hAnsi="DM Sans"/>
@@ -965,7 +965,7 @@
         </w:rPr>
         <w:t xml:space="preserve">Product consulting for </w:t>
       </w:r>
-      <w:hyperlink w:history="1" r:id="rIdxgujrberotshpts9elivp">
+      <w:hyperlink w:history="1" r:id="rIdnxydujev-ndce7z2btaum">
         <w:r>
           <w:rPr>
             <w:rFonts w:ascii="DM Sans" w:cs="DM Sans" w:eastAsia="DM Sans" w:hAnsi="DM Sans"/>
@@ -994,7 +994,7 @@
         </w:rPr>
         <w:t xml:space="preserve"> (SaaS, music industry); developed content strategy for </w:t>
       </w:r>
-      <w:hyperlink w:history="1" r:id="rIdx0ekq2lfturc98qk0imkm">
+      <w:hyperlink w:history="1" r:id="rIdpnrfnsvnfqphatifcetux">
         <w:r>
           <w:rPr>
             <w:rFonts w:ascii="DM Sans" w:cs="DM Sans" w:eastAsia="DM Sans" w:hAnsi="DM Sans"/>
@@ -1029,7 +1029,7 @@
         <w:keepNext/>
         <w:spacing w:after="0" w:before="200"/>
       </w:pPr>
-      <w:hyperlink w:history="1" r:id="rIdfciy5y4tl2b6wf1gy0mma">
+      <w:hyperlink w:history="1" r:id="rIdja20ttmtrpyp9ec9dqfbo">
         <w:r>
           <w:rPr>
             <w:rFonts w:ascii="DM Sans" w:cs="DM Sans" w:eastAsia="DM Sans" w:hAnsi="DM Sans"/>
@@ -1240,7 +1240,7 @@
         <w:keepNext/>
         <w:spacing w:after="0" w:before="200"/>
       </w:pPr>
-      <w:hyperlink w:history="1" r:id="rId_dvqphg0mkrvyewhaja-r">
+      <w:hyperlink w:history="1" r:id="rIdqlv6m7fwflughdlxsuvvk">
         <w:r>
           <w:rPr>
             <w:rFonts w:ascii="DM Sans" w:cs="DM Sans" w:eastAsia="DM Sans" w:hAnsi="DM Sans"/>
@@ -1401,7 +1401,7 @@
         <w:keepNext/>
         <w:spacing w:after="0" w:before="200"/>
       </w:pPr>
-      <w:hyperlink w:history="1" r:id="rIduazci_q71xprnh9z1978x">
+      <w:hyperlink w:history="1" r:id="rIdntfjb8vnc21xkmgazoiul">
         <w:r>
           <w:rPr>
             <w:rFonts w:ascii="DM Sans" w:cs="DM Sans" w:eastAsia="DM Sans" w:hAnsi="DM Sans"/>
@@ -1962,7 +1962,47 @@
         <w:keepNext/>
         <w:spacing w:after="60" w:before="0"/>
       </w:pPr>
-      <w:hyperlink w:history="1" r:id="rIdgccv4kaqyu50qal1ypjje">
+      <w:hyperlink w:history="1" r:id="rIdmewp64yzi42cfo0w9sfod">
+        <w:r>
+          <w:rPr>
+            <w:rFonts w:ascii="DM Sans" w:cs="DM Sans" w:eastAsia="DM Sans" w:hAnsi="DM Sans"/>
+            <w:b/>
+            <w:bCs/>
+            <w:i w:val="false"/>
+            <w:iCs w:val="false"/>
+            <w:color w:val="000000"/>
+            <w:sz w:val="24"/>
+            <w:szCs w:val="24"/>
+            <w:u w:val="single" w:color="000000"/>
+          </w:rPr>
+          <w:t xml:space="preserve">Building my personal website, malxavi.com</w:t>
+        </w:r>
+      </w:hyperlink>
+    </w:p>
+    <w:p>
+      <w:pPr>
+        <w:spacing w:after="40" w:before="0"/>
+      </w:pPr>
+      <w:r>
+        <w:rPr>
+          <w:rFonts w:ascii="DM Sans" w:cs="DM Sans" w:eastAsia="DM Sans" w:hAnsi="DM Sans"/>
+          <w:b w:val="false"/>
+          <w:bCs w:val="false"/>
+          <w:i w:val="false"/>
+          <w:iCs w:val="false"/>
+          <w:color w:val="000000"/>
+          <w:sz w:val="21"/>
+          <w:szCs w:val="21"/>
+        </w:rPr>
+        <w:t xml:space="preserve">A meta case study on shipping my personal website with Claude Code as build partner. Architecture bets, production incidents, and what AI-native PM work looks like when the human stays in the loop.</w:t>
+      </w:r>
+    </w:p>
+    <w:p>
+      <w:pPr>
+        <w:keepNext/>
+        <w:spacing w:after="60" w:before="200"/>
+      </w:pPr>
+      <w:hyperlink w:history="1" r:id="rIdofenorv3zsdqy7lzvhajz">
         <w:r>
           <w:rPr>
             <w:rFonts w:ascii="DM Sans" w:cs="DM Sans" w:eastAsia="DM Sans" w:hAnsi="DM Sans"/>
@@ -1994,47 +2034,7 @@
           <w:sz w:val="21"/>
           <w:szCs w:val="21"/>
         </w:rPr>
-        <w:t xml:space="preserve">One architectural rule that keeps three integrations online when their upstreams break. Polite-client posture for the one with no API, TMDB enrichment for two. Sequel to Building this site.</w:t>
-      </w:r>
-    </w:p>
-    <w:p>
-      <w:pPr>
-        <w:keepNext/>
-        <w:spacing w:after="60" w:before="200"/>
-      </w:pPr>
-      <w:hyperlink w:history="1" r:id="rId7l3-qdklhaehpgcib9aql">
-        <w:r>
-          <w:rPr>
-            <w:rFonts w:ascii="DM Sans" w:cs="DM Sans" w:eastAsia="DM Sans" w:hAnsi="DM Sans"/>
-            <w:b/>
-            <w:bCs/>
-            <w:i w:val="false"/>
-            <w:iCs w:val="false"/>
-            <w:color w:val="000000"/>
-            <w:sz w:val="24"/>
-            <w:szCs w:val="24"/>
-            <w:u w:val="single" w:color="000000"/>
-          </w:rPr>
-          <w:t xml:space="preserve">Building my personal website, malxavi.com</w:t>
-        </w:r>
-      </w:hyperlink>
-    </w:p>
-    <w:p>
-      <w:pPr>
-        <w:spacing w:after="40" w:before="0"/>
-      </w:pPr>
-      <w:r>
-        <w:rPr>
-          <w:rFonts w:ascii="DM Sans" w:cs="DM Sans" w:eastAsia="DM Sans" w:hAnsi="DM Sans"/>
-          <w:b w:val="false"/>
-          <w:bCs w:val="false"/>
-          <w:i w:val="false"/>
-          <w:iCs w:val="false"/>
-          <w:color w:val="000000"/>
-          <w:sz w:val="21"/>
-          <w:szCs w:val="21"/>
-        </w:rPr>
-        <w:t xml:space="preserve">A meta case study on shipping my personal website with Claude Code as build partner. Architecture bets, production incidents, and what AI-native PM work looks like when the human stays in the loop.</w:t>
+        <w:t xml:space="preserve">One architectural rule that keeps three integrations online when their upstreams break. Polite-client posture for the one with no API, TMDB enrichment for two. Sequel to building my personal website.</w:t>
       </w:r>
     </w:p>
     <w:sectPr>
@@ -2172,7 +2172,7 @@
       </w:pBdr>
       <w:spacing w:after="80" w:before="40"/>
     </w:pPr>
-    <w:hyperlink w:history="1" r:id="rId6mci_qu8aupgmku6xr6jz">
+    <w:hyperlink w:history="1" r:id="rIdtvdgzw6egeiu_0f-14r_h">
       <w:r>
         <w:rPr>
           <w:rFonts w:ascii="DM Sans" w:cs="DM Sans" w:eastAsia="DM Sans" w:hAnsi="DM Sans"/>
@@ -2197,7 +2197,7 @@
       </w:rPr>
       <w:t xml:space="preserve"> · </w:t>
     </w:r>
-    <w:hyperlink w:history="1" r:id="rIdlwzu3ugpez1-_h1zutlvj">
+    <w:hyperlink w:history="1" r:id="rIdolpek2-mdm9tccaycourb">
       <w:r>
         <w:rPr>
           <w:rFonts w:ascii="DM Sans" w:cs="DM Sans" w:eastAsia="DM Sans" w:hAnsi="DM Sans"/>
@@ -2248,7 +2248,7 @@
       </w:rPr>
       <w:t xml:space="preserve"> · </w:t>
     </w:r>
-    <w:hyperlink w:history="1" r:id="rIdi6wq81kbsno7fcmvh3yye">
+    <w:hyperlink w:history="1" r:id="rId5ldarihfg-65cs4eatafy">
       <w:r>
         <w:rPr>
           <w:rFonts w:ascii="DM Sans" w:cs="DM Sans" w:eastAsia="DM Sans" w:hAnsi="DM Sans"/>
@@ -2273,7 +2273,7 @@
       </w:rPr>
       <w:t xml:space="preserve"> · </w:t>
     </w:r>
-    <w:hyperlink w:history="1" r:id="rIdozht-ke9h6ahkxuukbjjk">
+    <w:hyperlink w:history="1" r:id="rIdxtmbweqs-gbnehg5kkmje">
       <w:r>
         <w:rPr>
           <w:rFonts w:ascii="DM Sans" w:cs="DM Sans" w:eastAsia="DM Sans" w:hAnsi="DM Sans"/>
@@ -2298,7 +2298,7 @@
       </w:rPr>
       <w:t xml:space="preserve"> · </w:t>
     </w:r>
-    <w:hyperlink w:history="1" r:id="rIdkubvacyybf9sjhkqjqxsm">
+    <w:hyperlink w:history="1" r:id="rIdrdnuaa4dxuwebms6o9im1">
       <w:r>
         <w:rPr>
           <w:rFonts w:ascii="DM Sans" w:cs="DM Sans" w:eastAsia="DM Sans" w:hAnsi="DM Sans"/>

</xml_diff>

<commit_message>
Regenerate resume docx and PDF for the quoted context line
Co-Authored-By: Claude Opus 4.7 (1M context) <noreply@anthropic.com>
</commit_message>
<xml_diff>
--- a/public/resume/malcolm-xavier-resume-template.docx
+++ b/public/resume/malcolm-xavier-resume-template.docx
@@ -40,7 +40,7 @@
       <w:pPr>
         <w:spacing w:after="40" w:before="0"/>
       </w:pPr>
-      <w:hyperlink w:history="1" r:id="rIddmi7uejicohf4ipe4weu_">
+      <w:hyperlink w:history="1" r:id="rId721jryhwlc1zvkhq4g9ja">
         <w:r>
           <w:rPr>
             <w:rFonts w:ascii="DM Sans" w:cs="DM Sans" w:eastAsia="DM Sans" w:hAnsi="DM Sans"/>
@@ -69,7 +69,7 @@
         </w:rPr>
         <w:t xml:space="preserve"> · </w:t>
       </w:r>
-      <w:hyperlink w:history="1" r:id="rIdgenwcyivdpb1_fu_3b1cw">
+      <w:hyperlink w:history="1" r:id="rIdl6zeflpzuwwvzrx46xj3j">
         <w:r>
           <w:rPr>
             <w:rFonts w:ascii="DM Sans" w:cs="DM Sans" w:eastAsia="DM Sans" w:hAnsi="DM Sans"/>
@@ -116,7 +116,7 @@
       <w:pPr>
         <w:spacing w:after="200" w:before="0"/>
       </w:pPr>
-      <w:hyperlink w:history="1" r:id="rId3oexyyi_zajhaznkd3evn">
+      <w:hyperlink w:history="1" r:id="rIduuadqbvt5kxoxxkd6_e-n">
         <w:r>
           <w:rPr>
             <w:rFonts w:ascii="DM Sans" w:cs="DM Sans" w:eastAsia="DM Sans" w:hAnsi="DM Sans"/>
@@ -145,7 +145,7 @@
         </w:rPr>
         <w:t xml:space="preserve"> · </w:t>
       </w:r>
-      <w:hyperlink w:history="1" r:id="rIdlyzhf__x7c3o2mrvpn0g7">
+      <w:hyperlink w:history="1" r:id="rIdas8otaxwbdb3t67zc1nau">
         <w:r>
           <w:rPr>
             <w:rFonts w:ascii="DM Sans" w:cs="DM Sans" w:eastAsia="DM Sans" w:hAnsi="DM Sans"/>
@@ -174,7 +174,7 @@
         </w:rPr>
         <w:t xml:space="preserve"> · </w:t>
       </w:r>
-      <w:hyperlink w:history="1" r:id="rIdtwjc66jwagqw3lnisbfoc">
+      <w:hyperlink w:history="1" r:id="rIdagj5qmaginpsg0njuefws">
         <w:r>
           <w:rPr>
             <w:rFonts w:ascii="DM Sans" w:cs="DM Sans" w:eastAsia="DM Sans" w:hAnsi="DM Sans"/>
@@ -235,7 +235,7 @@
         <w:keepNext/>
         <w:spacing w:after="0" w:before="0"/>
       </w:pPr>
-      <w:hyperlink w:history="1" r:id="rIdh2ebl82vbe-f6lbqyfwo3">
+      <w:hyperlink w:history="1" r:id="rIdoefaqs60ozqubfvbveoj4">
         <w:r>
           <w:rPr>
             <w:rFonts w:ascii="DM Sans" w:cs="DM Sans" w:eastAsia="DM Sans" w:hAnsi="DM Sans"/>
@@ -313,7 +313,7 @@
           <w:sz w:val="21"/>
           <w:szCs w:val="21"/>
         </w:rPr>
-        <w:t xml:space="preserve">America's largest publisher (formerly Dotdash Meredith). Scaled growth/MarTech platform for a network of 40+ brands and 22M+ users.</w:t>
+        <w:t xml:space="preserve">“America's largest publisher” (formerly Dotdash Meredith). Scaled growth/MarTech platform for a network of 40+ brands and 22M+ users.</w:t>
       </w:r>
     </w:p>
     <w:p>
@@ -653,7 +653,7 @@
         <w:keepNext/>
         <w:spacing w:after="0" w:before="200"/>
       </w:pPr>
-      <w:hyperlink w:history="1" r:id="rId8cfc1hlz4pyyul9bltbum">
+      <w:hyperlink w:history="1" r:id="rIda1s4teuyjqhg-neh1qbvj">
         <w:r>
           <w:rPr>
             <w:rFonts w:ascii="DM Sans" w:cs="DM Sans" w:eastAsia="DM Sans" w:hAnsi="DM Sans"/>
@@ -965,7 +965,7 @@
         </w:rPr>
         <w:t xml:space="preserve">Product consulting for </w:t>
       </w:r>
-      <w:hyperlink w:history="1" r:id="rIdnxydujev-ndce7z2btaum">
+      <w:hyperlink w:history="1" r:id="rIdyq-sg-178s3czi1kb9ujz">
         <w:r>
           <w:rPr>
             <w:rFonts w:ascii="DM Sans" w:cs="DM Sans" w:eastAsia="DM Sans" w:hAnsi="DM Sans"/>
@@ -994,7 +994,7 @@
         </w:rPr>
         <w:t xml:space="preserve"> (SaaS, music industry); developed content strategy for </w:t>
       </w:r>
-      <w:hyperlink w:history="1" r:id="rIdpnrfnsvnfqphatifcetux">
+      <w:hyperlink w:history="1" r:id="rIdeihxkd5pbvb_7ibpis10b">
         <w:r>
           <w:rPr>
             <w:rFonts w:ascii="DM Sans" w:cs="DM Sans" w:eastAsia="DM Sans" w:hAnsi="DM Sans"/>
@@ -1029,7 +1029,7 @@
         <w:keepNext/>
         <w:spacing w:after="0" w:before="200"/>
       </w:pPr>
-      <w:hyperlink w:history="1" r:id="rIdja20ttmtrpyp9ec9dqfbo">
+      <w:hyperlink w:history="1" r:id="rIdr4sdx71buhfdkqydqws1y">
         <w:r>
           <w:rPr>
             <w:rFonts w:ascii="DM Sans" w:cs="DM Sans" w:eastAsia="DM Sans" w:hAnsi="DM Sans"/>
@@ -1240,7 +1240,7 @@
         <w:keepNext/>
         <w:spacing w:after="0" w:before="200"/>
       </w:pPr>
-      <w:hyperlink w:history="1" r:id="rIdqlv6m7fwflughdlxsuvvk">
+      <w:hyperlink w:history="1" r:id="rIda2to2frfcrnemf06lufya">
         <w:r>
           <w:rPr>
             <w:rFonts w:ascii="DM Sans" w:cs="DM Sans" w:eastAsia="DM Sans" w:hAnsi="DM Sans"/>
@@ -1401,7 +1401,7 @@
         <w:keepNext/>
         <w:spacing w:after="0" w:before="200"/>
       </w:pPr>
-      <w:hyperlink w:history="1" r:id="rIdntfjb8vnc21xkmgazoiul">
+      <w:hyperlink w:history="1" r:id="rId7zxdiququlc1mdbhn_2e4">
         <w:r>
           <w:rPr>
             <w:rFonts w:ascii="DM Sans" w:cs="DM Sans" w:eastAsia="DM Sans" w:hAnsi="DM Sans"/>
@@ -1962,7 +1962,7 @@
         <w:keepNext/>
         <w:spacing w:after="60" w:before="0"/>
       </w:pPr>
-      <w:hyperlink w:history="1" r:id="rIdmewp64yzi42cfo0w9sfod">
+      <w:hyperlink w:history="1" r:id="rId6f2s0qialb2wpejpugqod">
         <w:r>
           <w:rPr>
             <w:rFonts w:ascii="DM Sans" w:cs="DM Sans" w:eastAsia="DM Sans" w:hAnsi="DM Sans"/>
@@ -2002,7 +2002,7 @@
         <w:keepNext/>
         <w:spacing w:after="60" w:before="200"/>
       </w:pPr>
-      <w:hyperlink w:history="1" r:id="rIdofenorv3zsdqy7lzvhajz">
+      <w:hyperlink w:history="1" r:id="rIdfhxsr8p-_dekjuciyhwww">
         <w:r>
           <w:rPr>
             <w:rFonts w:ascii="DM Sans" w:cs="DM Sans" w:eastAsia="DM Sans" w:hAnsi="DM Sans"/>
@@ -2172,7 +2172,7 @@
       </w:pBdr>
       <w:spacing w:after="80" w:before="40"/>
     </w:pPr>
-    <w:hyperlink w:history="1" r:id="rIdtvdgzw6egeiu_0f-14r_h">
+    <w:hyperlink w:history="1" r:id="rIdpovi9plefsnlvnnjcshgk">
       <w:r>
         <w:rPr>
           <w:rFonts w:ascii="DM Sans" w:cs="DM Sans" w:eastAsia="DM Sans" w:hAnsi="DM Sans"/>
@@ -2197,7 +2197,7 @@
       </w:rPr>
       <w:t xml:space="preserve"> · </w:t>
     </w:r>
-    <w:hyperlink w:history="1" r:id="rIdolpek2-mdm9tccaycourb">
+    <w:hyperlink w:history="1" r:id="rId_e02if2wcxntuhdqgbhre">
       <w:r>
         <w:rPr>
           <w:rFonts w:ascii="DM Sans" w:cs="DM Sans" w:eastAsia="DM Sans" w:hAnsi="DM Sans"/>
@@ -2248,7 +2248,7 @@
       </w:rPr>
       <w:t xml:space="preserve"> · </w:t>
     </w:r>
-    <w:hyperlink w:history="1" r:id="rId5ldarihfg-65cs4eatafy">
+    <w:hyperlink w:history="1" r:id="rIdbefptwhbqowd5vlbsqwkn">
       <w:r>
         <w:rPr>
           <w:rFonts w:ascii="DM Sans" w:cs="DM Sans" w:eastAsia="DM Sans" w:hAnsi="DM Sans"/>
@@ -2273,7 +2273,7 @@
       </w:rPr>
       <w:t xml:space="preserve"> · </w:t>
     </w:r>
-    <w:hyperlink w:history="1" r:id="rIdxtmbweqs-gbnehg5kkmje">
+    <w:hyperlink w:history="1" r:id="rIdmd-jsr1d6r9_duqli0hb9">
       <w:r>
         <w:rPr>
           <w:rFonts w:ascii="DM Sans" w:cs="DM Sans" w:eastAsia="DM Sans" w:hAnsi="DM Sans"/>
@@ -2298,7 +2298,7 @@
       </w:rPr>
       <w:t xml:space="preserve"> · </w:t>
     </w:r>
-    <w:hyperlink w:history="1" r:id="rIdrdnuaa4dxuwebms6o9im1">
+    <w:hyperlink w:history="1" r:id="rIdcwza6hjhy30bfcf0kkhqo">
       <w:r>
         <w:rPr>
           <w:rFonts w:ascii="DM Sans" w:cs="DM Sans" w:eastAsia="DM Sans" w:hAnsi="DM Sans"/>

</xml_diff>

<commit_message>
Reframe the résumé around The Booth and the AI training record
The consulting block now names The Booth and links to its page, adds the
privacy rule for its automation, describes Fleet as training-data work
rather than evaluation, and gives DataAnnotation the evaluation record.
The summary closes on three years of hands-on LLM and agent training and
evaluation. The site keeps the fuller lines and the docx the tight ones,
so the sync check now holds each summary to its own surface. The site
description, Person JSON-LD, and llms.txt follow suit.

Co-Authored-By: Claude Opus 5 <noreply@anthropic.com>
Claude-Session: https://claude.ai/code/session_011fUZkNUmpHXrNK2AyvguT1
</commit_message>
<xml_diff>
--- a/public/resume/malcolm-xavier-resume-template.docx
+++ b/public/resume/malcolm-xavier-resume-template.docx
@@ -40,7 +40,7 @@
       <w:pPr>
         <w:spacing w:after="40" w:before="0"/>
       </w:pPr>
-      <w:hyperlink w:history="1" r:id="rIdyvq1wuegfbj4w1ripa579">
+      <w:hyperlink w:history="1" r:id="rIdwb2telgiy-ptlfiocqgux">
         <w:r>
           <w:rPr>
             <w:rFonts w:ascii="DM Sans" w:cs="DM Sans" w:eastAsia="DM Sans" w:hAnsi="DM Sans"/>
@@ -69,7 +69,7 @@
         </w:rPr>
         <w:t xml:space="preserve"> · </w:t>
       </w:r>
-      <w:hyperlink w:history="1" r:id="rIdr-ykbexs3qses4llay8ca">
+      <w:hyperlink w:history="1" r:id="rIdjephystb9gyrpvimm56rq">
         <w:r>
           <w:rPr>
             <w:rFonts w:ascii="DM Sans" w:cs="DM Sans" w:eastAsia="DM Sans" w:hAnsi="DM Sans"/>
@@ -116,7 +116,7 @@
       <w:pPr>
         <w:spacing w:after="200" w:before="0"/>
       </w:pPr>
-      <w:hyperlink w:history="1" r:id="rIddi_ckoqtx4b36pfgrg4a9">
+      <w:hyperlink w:history="1" r:id="rId-ldh3zh8tfzd18kdc6fs-">
         <w:r>
           <w:rPr>
             <w:rFonts w:ascii="DM Sans" w:cs="DM Sans" w:eastAsia="DM Sans" w:hAnsi="DM Sans"/>
@@ -145,7 +145,7 @@
         </w:rPr>
         <w:t xml:space="preserve"> · </w:t>
       </w:r>
-      <w:hyperlink w:history="1" r:id="rIdx_du5niyestcgghm3qc4o">
+      <w:hyperlink w:history="1" r:id="rIdpxvfc-dqpuencgnrv7lav">
         <w:r>
           <w:rPr>
             <w:rFonts w:ascii="DM Sans" w:cs="DM Sans" w:eastAsia="DM Sans" w:hAnsi="DM Sans"/>
@@ -174,7 +174,7 @@
         </w:rPr>
         <w:t xml:space="preserve"> · </w:t>
       </w:r>
-      <w:hyperlink w:history="1" r:id="rIdr0mcx7blnbi8odzgvwgv0">
+      <w:hyperlink w:history="1" r:id="rIduhp3lheyfsuiixqom85lc">
         <w:r>
           <w:rPr>
             <w:rFonts w:ascii="DM Sans" w:cs="DM Sans" w:eastAsia="DM Sans" w:hAnsi="DM Sans"/>
@@ -206,7 +206,7 @@
           <w:sz w:val="21"/>
           <w:szCs w:val="21"/>
         </w:rPr>
-        <w:t xml:space="preserve">Senior Product Manager with 7+ years scaling growth, marketing, and data platforms in media, publishing, and B2B SaaS. Built and operated MarTech infrastructure for 22M+ users across 40+ brands, driving 33% YoY email revenue growth. Applied an MS in Law (focused on data privacy and IP) to data governance and compliance-related roadmap tradeoffs. Architects AI-native discovery and delivery loops—roadmapping, outcome measurement, and documentation.</w:t>
+        <w:t xml:space="preserve">Senior Product Manager with 7+ years scaling growth, marketing, and data platforms in media, publishing, and B2B SaaS. Built and operated MarTech infrastructure for 22M+ users across 40+ brands, driving 33% YoY email revenue growth. Applied an MS in Law (focused on data privacy and IP) to data governance and compliance-related roadmap tradeoffs. Architects AI-native discovery and delivery loops, with three years of hands-on LLM and agent training and evaluation.</w:t>
       </w:r>
     </w:p>
     <w:p>
@@ -310,7 +310,7 @@
           <w:sz w:val="21"/>
           <w:szCs w:val="21"/>
         </w:rPr>
-        <w:t xml:space="preserve">Independent product, data, and content-strategy practice—growth systems, MarTech and customer data platforms, privacy-aware data governance, and AI-native product and content operations.</w:t>
+        <w:t xml:space="preserve">Independent product, data, and content-strategy practice—growth systems, MarTech and customer data platforms, privacy-aware data governance, AI-native operations, and AI training and evaluation.</w:t>
       </w:r>
     </w:p>
     <w:p>
@@ -335,7 +335,36 @@
           <w:sz w:val="21"/>
           <w:szCs w:val="21"/>
         </w:rPr>
-        <w:t xml:space="preserve">Build and operate my own products—malxavi.com and the editorial operation behind my published writing—on an AI-native setup, with agentic workflows in the loop from roadmap to ship</w:t>
+        <w:t xml:space="preserve">Build and operate </w:t>
+      </w:r>
+      <w:hyperlink w:history="1" r:id="rIdamek7nkquxg38vztzhqfp">
+        <w:r>
+          <w:rPr>
+            <w:rFonts w:ascii="DM Sans" w:cs="DM Sans" w:eastAsia="DM Sans" w:hAnsi="DM Sans"/>
+            <w:b w:val="false"/>
+            <w:bCs w:val="false"/>
+            <w:i w:val="false"/>
+            <w:iCs w:val="false"/>
+            <w:color w:val="000000"/>
+            <w:sz w:val="21"/>
+            <w:szCs w:val="21"/>
+            <w:u w:val="single" w:color="000000"/>
+          </w:rPr>
+          <w:t xml:space="preserve">The Booth</w:t>
+        </w:r>
+      </w:hyperlink>
+      <w:r>
+        <w:rPr>
+          <w:rFonts w:ascii="DM Sans" w:cs="DM Sans" w:eastAsia="DM Sans" w:hAnsi="DM Sans"/>
+          <w:b w:val="false"/>
+          <w:bCs w:val="false"/>
+          <w:i w:val="false"/>
+          <w:iCs w:val="false"/>
+          <w:color w:val="000000"/>
+          <w:sz w:val="21"/>
+          <w:szCs w:val="21"/>
+        </w:rPr>
+        <w:t xml:space="preserve"> on Claude Code, the AI-native system I plan and ship my own work from: one prioritized day across six workstreams, agents that run unattended on a schedule, and every automated write logged and reversible</w:t>
       </w:r>
     </w:p>
     <w:p>
@@ -349,7 +378,32 @@
         <w:spacing w:after="40" w:before="0"/>
         <w:ind w:left="288"/>
       </w:pPr>
-      <w:hyperlink w:history="1" r:id="rIdfxyj6gjy-5z9rnt1iowfr">
+      <w:r>
+        <w:rPr>
+          <w:rFonts w:ascii="DM Sans" w:cs="DM Sans" w:eastAsia="DM Sans" w:hAnsi="DM Sans"/>
+          <w:b w:val="false"/>
+          <w:bCs w:val="false"/>
+          <w:i w:val="false"/>
+          <w:iCs w:val="false"/>
+          <w:color w:val="000000"/>
+          <w:sz w:val="21"/>
+          <w:szCs w:val="21"/>
+        </w:rPr>
+        <w:t xml:space="preserve">Set the privacy rules for The Booth's automation: the jobs that can reach the internet can't reach personal data</w:t>
+      </w:r>
+    </w:p>
+    <w:p>
+      <w:pPr>
+        <w:pStyle w:val="ListParagraph"/>
+        <w:keepNext/>
+        <w:numPr>
+          <w:ilvl w:val="0"/>
+          <w:numId w:val="1"/>
+        </w:numPr>
+        <w:spacing w:after="40" w:before="0"/>
+        <w:ind w:left="288"/>
+      </w:pPr>
+      <w:hyperlink w:history="1" r:id="rIdmqiwvsdutq3lsjfhso79d">
         <w:r>
           <w:rPr>
             <w:rFonts w:ascii="DM Sans" w:cs="DM Sans" w:eastAsia="DM Sans" w:hAnsi="DM Sans"/>
@@ -376,7 +430,7 @@
           <w:sz w:val="21"/>
           <w:szCs w:val="21"/>
         </w:rPr>
-        <w:t xml:space="preserve"> (2026–present): AI training and evaluation—prompting techniques, evaluation rubrics, and agent-behavior assessment for simulated-environment research</w:t>
+        <w:t xml:space="preserve"> (2026–present): AI training data—prompt development and change-logged sessions in simulated environments</w:t>
       </w:r>
     </w:p>
     <w:p>
@@ -390,7 +444,7 @@
         <w:spacing w:after="40" w:before="0"/>
         <w:ind w:left="288"/>
       </w:pPr>
-      <w:hyperlink w:history="1" r:id="rIdj32hpa1lkpffovcqbzn7r">
+      <w:hyperlink w:history="1" r:id="rIdau4vtaj7c8rxikciwj_ia">
         <w:r>
           <w:rPr>
             <w:rFonts w:ascii="DM Sans" w:cs="DM Sans" w:eastAsia="DM Sans" w:hAnsi="DM Sans"/>
@@ -417,7 +471,7 @@
           <w:sz w:val="21"/>
           <w:szCs w:val="21"/>
         </w:rPr>
-        <w:t xml:space="preserve"> (2023–2026): LLM and agent training—CoT and meta-prompting, evaluation rubrics and criteria, and peer review of model outputs</w:t>
+        <w:t xml:space="preserve"> (2023–2026): LLM and agent evaluation—prompts, including adversarial ones, plus criteria, rubrics, response grading, and peer review</w:t>
       </w:r>
     </w:p>
     <w:p>
@@ -430,7 +484,7 @@
         <w:spacing w:after="40" w:before="0"/>
         <w:ind w:left="288"/>
       </w:pPr>
-      <w:hyperlink w:history="1" r:id="rIdwztemkigxwgdtgraqjqc8">
+      <w:hyperlink w:history="1" r:id="rIdtkha98sloxvheuxfpfs3r">
         <w:r>
           <w:rPr>
             <w:rFonts w:ascii="DM Sans" w:cs="DM Sans" w:eastAsia="DM Sans" w:hAnsi="DM Sans"/>
@@ -465,7 +519,7 @@
         <w:keepNext/>
         <w:spacing w:after="0" w:before="200"/>
       </w:pPr>
-      <w:hyperlink w:history="1" r:id="rIdrarphrspktlio1eoidv1x">
+      <w:hyperlink w:history="1" r:id="rIdioaceca6ot4s7dbxm1frr">
         <w:r>
           <w:rPr>
             <w:rFonts w:ascii="DM Sans" w:cs="DM Sans" w:eastAsia="DM Sans" w:hAnsi="DM Sans"/>
@@ -728,7 +782,7 @@
         </w:rPr>
         <w:t xml:space="preserve">Case study: </w:t>
       </w:r>
-      <w:hyperlink w:history="1" r:id="rIdkf2br7hvz17ikaxpjny4a">
+      <w:hyperlink w:history="1" r:id="rId05zrdqqh7fcevgyc1vtnd">
         <w:r>
           <w:rPr>
             <w:rFonts w:ascii="DM Sans" w:cs="DM Sans" w:eastAsia="DM Sans" w:hAnsi="DM Sans"/>
@@ -750,7 +804,7 @@
         <w:keepNext/>
         <w:spacing w:after="0" w:before="200"/>
       </w:pPr>
-      <w:hyperlink w:history="1" r:id="rIdj2wwihd0fto94cib-n7tx">
+      <w:hyperlink w:history="1" r:id="rIdgl9lbweuw_jk2dwxopbdz">
         <w:r>
           <w:rPr>
             <w:rFonts w:ascii="DM Sans" w:cs="DM Sans" w:eastAsia="DM Sans" w:hAnsi="DM Sans"/>
@@ -1013,7 +1067,7 @@
         </w:rPr>
         <w:t xml:space="preserve">Case study: </w:t>
       </w:r>
-      <w:hyperlink w:history="1" r:id="rIdxhclfaehwixju8l61ti19">
+      <w:hyperlink w:history="1" r:id="rIdronuwct2nal8jeqmf411r">
         <w:r>
           <w:rPr>
             <w:rFonts w:ascii="DM Sans" w:cs="DM Sans" w:eastAsia="DM Sans" w:hAnsi="DM Sans"/>
@@ -1035,7 +1089,7 @@
         <w:keepNext/>
         <w:spacing w:after="0" w:before="200"/>
       </w:pPr>
-      <w:hyperlink w:history="1" r:id="rIdzjcph9b-m5qlafcwgmzdp">
+      <w:hyperlink w:history="1" r:id="rId8qw9ekl-azgtb7vuc60ak">
         <w:r>
           <w:rPr>
             <w:rFonts w:ascii="DM Sans" w:cs="DM Sans" w:eastAsia="DM Sans" w:hAnsi="DM Sans"/>
@@ -1260,7 +1314,7 @@
         </w:rPr>
         <w:t xml:space="preserve">Case study: </w:t>
       </w:r>
-      <w:hyperlink w:history="1" r:id="rIdzwbjqyo5aeqgxge35lzx5">
+      <w:hyperlink w:history="1" r:id="rIdviivhogunl0szv60udef8">
         <w:r>
           <w:rPr>
             <w:rFonts w:ascii="DM Sans" w:cs="DM Sans" w:eastAsia="DM Sans" w:hAnsi="DM Sans"/>
@@ -1282,7 +1336,7 @@
         <w:keepNext/>
         <w:spacing w:after="0" w:before="200"/>
       </w:pPr>
-      <w:hyperlink w:history="1" r:id="rIdfxghcirod_7uikq7pjifw">
+      <w:hyperlink w:history="1" r:id="rIdmwjpyvmnv7v7xwsqtmozv">
         <w:r>
           <w:rPr>
             <w:rFonts w:ascii="DM Sans" w:cs="DM Sans" w:eastAsia="DM Sans" w:hAnsi="DM Sans"/>
@@ -1443,7 +1497,7 @@
         <w:keepNext/>
         <w:spacing w:after="0" w:before="200"/>
       </w:pPr>
-      <w:hyperlink w:history="1" r:id="rIdsn4w6s_ps2h3pzclbzbuy">
+      <w:hyperlink w:history="1" r:id="rIdvn0iohuo7qq-1dkamcwdo">
         <w:r>
           <w:rPr>
             <w:rFonts w:ascii="DM Sans" w:cs="DM Sans" w:eastAsia="DM Sans" w:hAnsi="DM Sans"/>
@@ -1738,7 +1792,7 @@
         </w:rPr>
         <w:t xml:space="preserve">Presentation: </w:t>
       </w:r>
-      <w:hyperlink w:history="1" r:id="rIdptkrwtv1a96zrulfcpogk">
+      <w:hyperlink w:history="1" r:id="rIdmsn8rueafytevuejsyffx">
         <w:r>
           <w:rPr>
             <w:rFonts w:ascii="DM Sans" w:cs="DM Sans" w:eastAsia="DM Sans" w:hAnsi="DM Sans"/>
@@ -1880,7 +1934,7 @@
         </w:rPr>
         <w:t xml:space="preserve">Presentation: </w:t>
       </w:r>
-      <w:hyperlink w:history="1" r:id="rId3m7xeh46znv__poiii3ue">
+      <w:hyperlink w:history="1" r:id="rId2pgrrz3tijaspwiis8jvz">
         <w:r>
           <w:rPr>
             <w:rFonts w:ascii="DM Sans" w:cs="DM Sans" w:eastAsia="DM Sans" w:hAnsi="DM Sans"/>
@@ -2011,7 +2065,7 @@
         <w:keepNext/>
         <w:spacing w:after="60" w:before="0"/>
       </w:pPr>
-      <w:hyperlink w:history="1" r:id="rIdcm2lomj11vucbluop7ned">
+      <w:hyperlink w:history="1" r:id="rIdhlbkvq8tduknm4psdr0bg">
         <w:r>
           <w:rPr>
             <w:rFonts w:ascii="DM Sans" w:cs="DM Sans" w:eastAsia="DM Sans" w:hAnsi="DM Sans"/>
@@ -2051,7 +2105,7 @@
         <w:keepNext/>
         <w:spacing w:after="60" w:before="200"/>
       </w:pPr>
-      <w:hyperlink w:history="1" r:id="rIdmccyzl611c2vgmy00box1">
+      <w:hyperlink w:history="1" r:id="rIdbvf7fupq9gtt9egwvq12j">
         <w:r>
           <w:rPr>
             <w:rFonts w:ascii="DM Sans" w:cs="DM Sans" w:eastAsia="DM Sans" w:hAnsi="DM Sans"/>
@@ -2221,7 +2275,7 @@
       </w:pBdr>
       <w:spacing w:after="80" w:before="40"/>
     </w:pPr>
-    <w:hyperlink w:history="1" r:id="rIdokpxmjdn1l9kjen1mswgb">
+    <w:hyperlink w:history="1" r:id="rId6y2lkzuyg4ffowc1zwujl">
       <w:r>
         <w:rPr>
           <w:rFonts w:ascii="DM Sans" w:cs="DM Sans" w:eastAsia="DM Sans" w:hAnsi="DM Sans"/>
@@ -2246,7 +2300,7 @@
       </w:rPr>
       <w:t xml:space="preserve"> · </w:t>
     </w:r>
-    <w:hyperlink w:history="1" r:id="rIdswdrn1vafy8lenslbj7mx">
+    <w:hyperlink w:history="1" r:id="rIdxpuuc5e1n9fazq1wjghbh">
       <w:r>
         <w:rPr>
           <w:rFonts w:ascii="DM Sans" w:cs="DM Sans" w:eastAsia="DM Sans" w:hAnsi="DM Sans"/>
@@ -2297,7 +2351,7 @@
       </w:rPr>
       <w:t xml:space="preserve"> · </w:t>
     </w:r>
-    <w:hyperlink w:history="1" r:id="rIdkulqw8zjghuj1siwvy9w1">
+    <w:hyperlink w:history="1" r:id="rId3vb4zngflkgnxkdqwkxiy">
       <w:r>
         <w:rPr>
           <w:rFonts w:ascii="DM Sans" w:cs="DM Sans" w:eastAsia="DM Sans" w:hAnsi="DM Sans"/>
@@ -2322,7 +2376,7 @@
       </w:rPr>
       <w:t xml:space="preserve"> · </w:t>
     </w:r>
-    <w:hyperlink w:history="1" r:id="rIdisce-bo5n-fmmbcuspuq2">
+    <w:hyperlink w:history="1" r:id="rIdobutpgqdhzcajipynulbt">
       <w:r>
         <w:rPr>
           <w:rFonts w:ascii="DM Sans" w:cs="DM Sans" w:eastAsia="DM Sans" w:hAnsi="DM Sans"/>
@@ -2347,7 +2401,7 @@
       </w:rPr>
       <w:t xml:space="preserve"> · </w:t>
     </w:r>
-    <w:hyperlink w:history="1" r:id="rIdvngv8lhcfpwrgra0w40ai">
+    <w:hyperlink w:history="1" r:id="rIdz_n1npq7frpg9gw_6u4en">
       <w:r>
         <w:rPr>
           <w:rFonts w:ascii="DM Sans" w:cs="DM Sans" w:eastAsia="DM Sans" w:hAnsi="DM Sans"/>

</xml_diff>